<commit_message>
ansible - conditionals updated
</commit_message>
<xml_diff>
--- a/Ansible/9-conditionals.docx
+++ b/Ansible/9-conditionals.docx
@@ -1,6 +1,6 @@
 
 <file path=word/document.xml><?xml version="1.0" encoding="utf-8"?>
-<w:document xmlns:wpc="http://schemas.microsoft.com/office/word/2010/wordprocessingCanvas" xmlns:cx="http://schemas.microsoft.com/office/drawing/2014/chartex" xmlns:cx1="http://schemas.microsoft.com/office/drawing/2015/9/8/chartex" xmlns:cx2="http://schemas.microsoft.com/office/drawing/2015/10/21/chartex" xmlns:cx3="http://schemas.microsoft.com/office/drawing/2016/5/9/chartex" xmlns:cx4="http://schemas.microsoft.com/office/drawing/2016/5/10/chartex" xmlns:cx5="http://schemas.microsoft.com/office/drawing/2016/5/11/chartex" xmlns:cx6="http://schemas.microsoft.com/office/drawing/2016/5/12/chartex" xmlns:cx7="http://schemas.microsoft.com/office/drawing/2016/5/13/chartex" xmlns:cx8="http://schemas.microsoft.com/office/drawing/2016/5/14/chartex" xmlns:mc="http://schemas.openxmlformats.org/markup-compatibility/2006" xmlns:aink="http://schemas.microsoft.com/office/drawing/2016/ink" xmlns:am3d="http://schemas.microsoft.com/office/drawing/2017/model3d" xmlns:o="urn:schemas-microsoft-com:office:office" xmlns:oel="http://schemas.microsoft.com/office/2019/extlst" xmlns:r="http://schemas.openxmlformats.org/officeDocument/2006/relationships" xmlns:m="http://schemas.openxmlformats.org/officeDocument/2006/math" xmlns:v="urn:schemas-microsoft-com:vml" xmlns:wp14="http://schemas.microsoft.com/office/word/2010/wordprocessingDrawing" xmlns:wp="http://schemas.openxmlformats.org/drawingml/2006/wordprocessingDrawing" xmlns:w10="urn:schemas-microsoft-com:office:word" xmlns:w="http://schemas.openxmlformats.org/wordprocessingml/2006/main" xmlns:w14="http://schemas.microsoft.com/office/word/2010/wordml" xmlns:w15="http://schemas.microsoft.com/office/word/2012/wordml" xmlns:w16cex="http://schemas.microsoft.com/office/word/2018/wordml/cex" xmlns:w16cid="http://schemas.microsoft.com/office/word/2016/wordml/cid" xmlns:w16="http://schemas.microsoft.com/office/word/2018/wordml" xmlns:w16du="http://schemas.microsoft.com/office/word/2023/wordml/word16du" xmlns:w16sdtdh="http://schemas.microsoft.com/office/word/2020/wordml/sdtdatahash" xmlns:w16sdtfl="http://schemas.microsoft.com/office/word/2024/wordml/sdtformatlock" xmlns:w16se="http://schemas.microsoft.com/office/word/2015/wordml/symex" xmlns:wpg="http://schemas.microsoft.com/office/word/2010/wordprocessingGroup" xmlns:wpi="http://schemas.microsoft.com/office/word/2010/wordprocessingInk" xmlns:wne="http://schemas.microsoft.com/office/word/2006/wordml" xmlns:wps="http://schemas.microsoft.com/office/word/2010/wordprocessingShape" mc:Ignorable="w14 w15 w16se w16cid w16 w16cex w16sdtdh w16sdtfl w16du wp14">
+<w:document xmlns:wpc="http://schemas.microsoft.com/office/word/2010/wordprocessingCanvas" xmlns:cx="http://schemas.microsoft.com/office/drawing/2014/chartex" xmlns:cx1="http://schemas.microsoft.com/office/drawing/2015/9/8/chartex" xmlns:cx2="http://schemas.microsoft.com/office/drawing/2015/10/21/chartex" xmlns:cx3="http://schemas.microsoft.com/office/drawing/2016/5/9/chartex" xmlns:cx4="http://schemas.microsoft.com/office/drawing/2016/5/10/chartex" xmlns:cx5="http://schemas.microsoft.com/office/drawing/2016/5/11/chartex" xmlns:cx6="http://schemas.microsoft.com/office/drawing/2016/5/12/chartex" xmlns:cx7="http://schemas.microsoft.com/office/drawing/2016/5/13/chartex" xmlns:cx8="http://schemas.microsoft.com/office/drawing/2016/5/14/chartex" xmlns:mc="http://schemas.openxmlformats.org/markup-compatibility/2006" xmlns:aink="http://schemas.microsoft.com/office/drawing/2016/ink" xmlns:am3d="http://schemas.microsoft.com/office/drawing/2017/model3d" xmlns:o="urn:schemas-microsoft-com:office:office" xmlns:oel="http://schemas.microsoft.com/office/2019/extlst" xmlns:r="http://schemas.openxmlformats.org/officeDocument/2006/relationships" xmlns:m="http://schemas.openxmlformats.org/officeDocument/2006/math" xmlns:v="urn:schemas-microsoft-com:vml" xmlns:wp14="http://schemas.microsoft.com/office/word/2010/wordprocessingDrawing" xmlns:wp="http://schemas.openxmlformats.org/drawingml/2006/wordprocessingDrawing" xmlns:w10="urn:schemas-microsoft-com:office:word" xmlns:w="http://schemas.openxmlformats.org/wordprocessingml/2006/main" xmlns:w14="http://schemas.microsoft.com/office/word/2010/wordml" xmlns:w15="http://schemas.microsoft.com/office/word/2012/wordml" xmlns:w16cex="http://schemas.microsoft.com/office/word/2018/wordml/cex" xmlns:w16cid="http://schemas.microsoft.com/office/word/2016/wordml/cid" xmlns:w16="http://schemas.microsoft.com/office/word/2018/wordml" xmlns:w16sdtdh="http://schemas.microsoft.com/office/word/2020/wordml/sdtdatahash" xmlns:w16se="http://schemas.microsoft.com/office/word/2015/wordml/symex" xmlns:wpg="http://schemas.microsoft.com/office/word/2010/wordprocessingGroup" xmlns:wpi="http://schemas.microsoft.com/office/word/2010/wordprocessingInk" xmlns:wne="http://schemas.microsoft.com/office/word/2006/wordml" xmlns:wps="http://schemas.microsoft.com/office/word/2010/wordprocessingShape" mc:Ignorable="w14 w15 w16se w16cid w16 w16cex w16sdtdh wp14">
   <w:body>
     <w:p>
       <w:pPr>
@@ -6330,15 +6330,7 @@
           <w:sz w:val="28"/>
           <w:szCs w:val="28"/>
         </w:rPr>
-        <w:t xml:space="preserve"> </w:t>
-      </w:r>
-      <w:r>
-        <w:rPr>
-          <w:rFonts w:asciiTheme="majorBidi" w:hAnsiTheme="majorBidi" w:cstheme="majorBidi"/>
-          <w:sz w:val="28"/>
-          <w:szCs w:val="28"/>
-        </w:rPr>
-        <w:t>→ The standard conditional for skipping/running tasks.</w:t>
+        <w:t xml:space="preserve"> → The standard conditional for skipping/running tasks.</w:t>
       </w:r>
     </w:p>
     <w:p>
@@ -6376,15 +6368,7 @@
           <w:sz w:val="28"/>
           <w:szCs w:val="28"/>
         </w:rPr>
-        <w:t xml:space="preserve"> </w:t>
-      </w:r>
-      <w:r>
-        <w:rPr>
-          <w:rFonts w:asciiTheme="majorBidi" w:hAnsiTheme="majorBidi" w:cstheme="majorBidi"/>
-          <w:sz w:val="28"/>
-          <w:szCs w:val="28"/>
-        </w:rPr>
-        <w:t xml:space="preserve">→ </w:t>
+        <w:t xml:space="preserve"> → </w:t>
       </w:r>
       <w:r>
         <w:rPr>
@@ -6430,15 +6414,7 @@
           <w:sz w:val="28"/>
           <w:szCs w:val="28"/>
         </w:rPr>
-        <w:t xml:space="preserve"> </w:t>
-      </w:r>
-      <w:r>
-        <w:rPr>
-          <w:rFonts w:asciiTheme="majorBidi" w:hAnsiTheme="majorBidi" w:cstheme="majorBidi"/>
-          <w:sz w:val="28"/>
-          <w:szCs w:val="28"/>
-        </w:rPr>
-        <w:t xml:space="preserve">→ </w:t>
+        <w:t xml:space="preserve"> → </w:t>
       </w:r>
       <w:r>
         <w:rPr>
@@ -6482,15 +6458,7 @@
           <w:sz w:val="28"/>
           <w:szCs w:val="28"/>
         </w:rPr>
-        <w:t xml:space="preserve"> </w:t>
-      </w:r>
-      <w:r>
-        <w:rPr>
-          <w:rFonts w:asciiTheme="majorBidi" w:hAnsiTheme="majorBidi" w:cstheme="majorBidi"/>
-          <w:sz w:val="28"/>
-          <w:szCs w:val="28"/>
-        </w:rPr>
-        <w:t xml:space="preserve">→ </w:t>
+        <w:t xml:space="preserve"> → </w:t>
       </w:r>
       <w:r>
         <w:rPr>
@@ -6532,15 +6500,7 @@
           <w:sz w:val="28"/>
           <w:szCs w:val="28"/>
         </w:rPr>
-        <w:t xml:space="preserve"> </w:t>
-      </w:r>
-      <w:r>
-        <w:rPr>
-          <w:rFonts w:asciiTheme="majorBidi" w:hAnsiTheme="majorBidi" w:cstheme="majorBidi"/>
-          <w:sz w:val="28"/>
-          <w:szCs w:val="28"/>
-        </w:rPr>
-        <w:t xml:space="preserve">→ </w:t>
+        <w:t xml:space="preserve"> → </w:t>
       </w:r>
       <w:r>
         <w:rPr>
@@ -6763,6 +6723,7 @@
     </w:p>
     <w:p>
       <w:pPr>
+        <w:jc w:val="both"/>
         <w:rPr>
           <w:rFonts w:asciiTheme="majorBidi" w:hAnsiTheme="majorBidi" w:cstheme="majorBidi"/>
           <w:sz w:val="28"/>
@@ -6822,6 +6783,7 @@
     <w:p>
       <w:pPr>
         <w:spacing w:after="60"/>
+        <w:jc w:val="both"/>
         <w:rPr>
           <w:rFonts w:asciiTheme="majorBidi" w:hAnsiTheme="majorBidi" w:cstheme="majorBidi"/>
           <w:b/>
@@ -6854,6 +6816,7 @@
     <w:p>
       <w:pPr>
         <w:spacing w:after="60"/>
+        <w:jc w:val="both"/>
         <w:rPr>
           <w:rFonts w:asciiTheme="majorBidi" w:hAnsiTheme="majorBidi" w:cstheme="majorBidi"/>
           <w:sz w:val="28"/>
@@ -6877,6 +6840,7 @@
           <w:numId w:val="5"/>
         </w:numPr>
         <w:ind w:left="360"/>
+        <w:jc w:val="both"/>
         <w:rPr>
           <w:rFonts w:asciiTheme="majorBidi" w:hAnsiTheme="majorBidi" w:cstheme="majorBidi"/>
           <w:sz w:val="28"/>
@@ -6910,6 +6874,7 @@
           <w:numId w:val="5"/>
         </w:numPr>
         <w:ind w:left="360"/>
+        <w:jc w:val="both"/>
         <w:rPr>
           <w:rFonts w:asciiTheme="majorBidi" w:hAnsiTheme="majorBidi" w:cstheme="majorBidi"/>
           <w:sz w:val="28"/>
@@ -6945,31 +6910,22 @@
           <w:numId w:val="5"/>
         </w:numPr>
         <w:ind w:left="360"/>
-        <w:rPr>
-          <w:rFonts w:asciiTheme="majorBidi" w:hAnsiTheme="majorBidi" w:cstheme="majorBidi"/>
-          <w:sz w:val="28"/>
-          <w:szCs w:val="28"/>
-        </w:rPr>
-      </w:pPr>
-      <w:r>
-        <w:rPr>
-          <w:rFonts w:asciiTheme="majorBidi" w:hAnsiTheme="majorBidi" w:cstheme="majorBidi"/>
-          <w:b/>
-          <w:bCs/>
-          <w:sz w:val="28"/>
-          <w:szCs w:val="28"/>
-        </w:rPr>
-        <w:t>&gt;</w:t>
-      </w:r>
-      <w:r>
-        <w:rPr>
-          <w:rFonts w:asciiTheme="majorBidi" w:hAnsiTheme="majorBidi" w:cstheme="majorBidi"/>
-          <w:b/>
-          <w:bCs/>
-          <w:sz w:val="28"/>
-          <w:szCs w:val="28"/>
-        </w:rPr>
-        <w:t xml:space="preserve"> </w:t>
+        <w:jc w:val="both"/>
+        <w:rPr>
+          <w:rFonts w:asciiTheme="majorBidi" w:hAnsiTheme="majorBidi" w:cstheme="majorBidi"/>
+          <w:sz w:val="28"/>
+          <w:szCs w:val="28"/>
+        </w:rPr>
+      </w:pPr>
+      <w:r>
+        <w:rPr>
+          <w:rFonts w:asciiTheme="majorBidi" w:hAnsiTheme="majorBidi" w:cstheme="majorBidi"/>
+          <w:b/>
+          <w:bCs/>
+          <w:sz w:val="28"/>
+          <w:szCs w:val="28"/>
+        </w:rPr>
+        <w:t xml:space="preserve">&gt; </w:t>
       </w:r>
       <w:r>
         <w:rPr>
@@ -6988,6 +6944,7 @@
           <w:numId w:val="5"/>
         </w:numPr>
         <w:ind w:left="360"/>
+        <w:jc w:val="both"/>
         <w:rPr>
           <w:rFonts w:asciiTheme="majorBidi" w:hAnsiTheme="majorBidi" w:cstheme="majorBidi"/>
           <w:sz w:val="28"/>
@@ -7021,6 +6978,7 @@
           <w:numId w:val="5"/>
         </w:numPr>
         <w:ind w:left="360"/>
+        <w:jc w:val="both"/>
         <w:rPr>
           <w:rFonts w:asciiTheme="majorBidi" w:hAnsiTheme="majorBidi" w:cstheme="majorBidi"/>
           <w:sz w:val="28"/>
@@ -7055,6 +7013,7 @@
         </w:numPr>
         <w:spacing w:after="80"/>
         <w:ind w:left="360"/>
+        <w:jc w:val="both"/>
         <w:rPr>
           <w:rFonts w:asciiTheme="majorBidi" w:hAnsiTheme="majorBidi" w:cstheme="majorBidi"/>
           <w:sz w:val="28"/>
@@ -7083,6 +7042,7 @@
     <w:p>
       <w:pPr>
         <w:spacing w:after="60"/>
+        <w:jc w:val="both"/>
         <w:rPr>
           <w:rFonts w:asciiTheme="majorBidi" w:hAnsiTheme="majorBidi" w:cstheme="majorBidi"/>
           <w:sz w:val="28"/>
@@ -7103,6 +7063,7 @@
     <w:p>
       <w:pPr>
         <w:spacing w:after="100"/>
+        <w:jc w:val="both"/>
         <w:rPr>
           <w:rFonts w:asciiTheme="majorBidi" w:hAnsiTheme="majorBidi" w:cstheme="majorBidi"/>
           <w:b/>
@@ -7181,6 +7142,7 @@
     <w:p>
       <w:pPr>
         <w:spacing w:after="80"/>
+        <w:jc w:val="both"/>
         <w:rPr>
           <w:rFonts w:asciiTheme="majorBidi" w:hAnsiTheme="majorBidi" w:cstheme="majorBidi"/>
           <w:b/>
@@ -7203,6 +7165,7 @@
     <w:p>
       <w:pPr>
         <w:spacing w:after="60"/>
+        <w:jc w:val="both"/>
         <w:rPr>
           <w:rFonts w:asciiTheme="majorBidi" w:hAnsiTheme="majorBidi" w:cstheme="majorBidi"/>
           <w:sz w:val="28"/>
@@ -7226,6 +7189,7 @@
           <w:numId w:val="6"/>
         </w:numPr>
         <w:ind w:left="360"/>
+        <w:jc w:val="both"/>
         <w:rPr>
           <w:rFonts w:asciiTheme="majorBidi" w:hAnsiTheme="majorBidi" w:cstheme="majorBidi"/>
           <w:b/>
@@ -7257,6 +7221,7 @@
           <w:numId w:val="6"/>
         </w:numPr>
         <w:ind w:left="360"/>
+        <w:jc w:val="both"/>
         <w:rPr>
           <w:rFonts w:asciiTheme="majorBidi" w:hAnsiTheme="majorBidi" w:cstheme="majorBidi"/>
           <w:b/>
@@ -7289,6 +7254,7 @@
         </w:numPr>
         <w:spacing w:after="80"/>
         <w:ind w:left="360"/>
+        <w:jc w:val="both"/>
         <w:rPr>
           <w:rFonts w:asciiTheme="majorBidi" w:hAnsiTheme="majorBidi" w:cstheme="majorBidi"/>
           <w:b/>
@@ -7315,6 +7281,7 @@
     <w:p>
       <w:pPr>
         <w:spacing w:after="80"/>
+        <w:jc w:val="both"/>
         <w:rPr>
           <w:rFonts w:asciiTheme="majorBidi" w:hAnsiTheme="majorBidi" w:cstheme="majorBidi"/>
           <w:sz w:val="28"/>
@@ -7335,6 +7302,7 @@
     <w:p>
       <w:pPr>
         <w:spacing w:after="80"/>
+        <w:jc w:val="both"/>
         <w:rPr>
           <w:rFonts w:asciiTheme="majorBidi" w:hAnsiTheme="majorBidi" w:cstheme="majorBidi"/>
           <w:b/>
@@ -7427,6 +7395,7 @@
     <w:p>
       <w:pPr>
         <w:spacing w:after="60"/>
+        <w:jc w:val="both"/>
         <w:rPr>
           <w:rFonts w:asciiTheme="majorBidi" w:hAnsiTheme="majorBidi" w:cstheme="majorBidi"/>
           <w:sz w:val="28"/>
@@ -7474,6 +7443,7 @@
     </w:p>
     <w:p>
       <w:pPr>
+        <w:jc w:val="both"/>
         <w:rPr>
           <w:rFonts w:asciiTheme="majorBidi" w:hAnsiTheme="majorBidi" w:cstheme="majorBidi"/>
           <w:sz w:val="28"/>
@@ -7712,7 +7682,7 @@
           </mc:Choice>
           <mc:Fallback>
             <w:pict>
-              <v:rect w14:anchorId="304C3E79" id="Rectangle 9" o:spid="_x0000_s1034" style="position:absolute;margin-left:0;margin-top:.35pt;width:247.2pt;height:61.2pt;z-index:251667456;visibility:visible;mso-wrap-style:square;mso-width-percent:0;mso-height-percent:0;mso-wrap-distance-left:9pt;mso-wrap-distance-top:0;mso-wrap-distance-right:9pt;mso-wrap-distance-bottom:0;mso-position-horizontal:left;mso-position-horizontal-relative:margin;mso-position-vertical:absolute;mso-position-vertical-relative:text;mso-width-percent:0;mso-height-percent:0;mso-width-relative:margin;mso-height-relative:margin;v-text-anchor:middle" o:gfxdata="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" fillcolor="black [3200]" strokecolor="black [480]" strokeweight="1pt">
+              <v:rect w14:anchorId="304C3E79" id="Rectangle 9" o:spid="_x0000_s1034" style="position:absolute;left:0;text-align:left;margin-left:0;margin-top:.35pt;width:247.2pt;height:61.2pt;z-index:251667456;visibility:visible;mso-wrap-style:square;mso-width-percent:0;mso-height-percent:0;mso-wrap-distance-left:9pt;mso-wrap-distance-top:0;mso-wrap-distance-right:9pt;mso-wrap-distance-bottom:0;mso-position-horizontal:left;mso-position-horizontal-relative:margin;mso-position-vertical:absolute;mso-position-vertical-relative:text;mso-width-percent:0;mso-height-percent:0;mso-width-relative:margin;mso-height-relative:margin;v-text-anchor:middle" o:gfxdata="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" fillcolor="black [3200]" strokecolor="black [480]" strokeweight="1pt">
                 <v:textbox>
                   <w:txbxContent>
                     <w:p>
@@ -7882,15 +7852,17 @@
     </w:p>
     <w:p>
       <w:pPr>
-        <w:rPr>
-          <w:rFonts w:asciiTheme="majorBidi" w:hAnsiTheme="majorBidi" w:cstheme="majorBidi"/>
-          <w:sz w:val="28"/>
-          <w:szCs w:val="28"/>
-        </w:rPr>
-      </w:pPr>
-    </w:p>
-    <w:p>
-      <w:pPr>
+        <w:jc w:val="both"/>
+        <w:rPr>
+          <w:rFonts w:asciiTheme="majorBidi" w:hAnsiTheme="majorBidi" w:cstheme="majorBidi"/>
+          <w:sz w:val="28"/>
+          <w:szCs w:val="28"/>
+        </w:rPr>
+      </w:pPr>
+    </w:p>
+    <w:p>
+      <w:pPr>
+        <w:jc w:val="both"/>
         <w:rPr>
           <w:rFonts w:asciiTheme="majorBidi" w:hAnsiTheme="majorBidi" w:cstheme="majorBidi"/>
           <w:sz w:val="12"/>
@@ -7901,6 +7873,7 @@
     <w:p>
       <w:pPr>
         <w:spacing w:after="80"/>
+        <w:jc w:val="both"/>
         <w:rPr>
           <w:rFonts w:asciiTheme="majorBidi" w:hAnsiTheme="majorBidi" w:cstheme="majorBidi"/>
           <w:b/>
@@ -7945,6 +7918,7 @@
     <w:p>
       <w:pPr>
         <w:spacing w:after="60"/>
+        <w:jc w:val="both"/>
         <w:rPr>
           <w:rFonts w:asciiTheme="majorBidi" w:hAnsiTheme="majorBidi" w:cstheme="majorBidi"/>
           <w:sz w:val="28"/>
@@ -7968,6 +7942,7 @@
           <w:numId w:val="7"/>
         </w:numPr>
         <w:ind w:left="360"/>
+        <w:jc w:val="both"/>
         <w:rPr>
           <w:rFonts w:asciiTheme="majorBidi" w:hAnsiTheme="majorBidi" w:cstheme="majorBidi"/>
           <w:b/>
@@ -8000,6 +7975,7 @@
         </w:numPr>
         <w:spacing w:after="80"/>
         <w:ind w:left="360"/>
+        <w:jc w:val="both"/>
         <w:rPr>
           <w:rFonts w:asciiTheme="majorBidi" w:hAnsiTheme="majorBidi" w:cstheme="majorBidi"/>
           <w:b/>
@@ -8026,6 +8002,7 @@
     <w:p>
       <w:pPr>
         <w:spacing w:after="80"/>
+        <w:jc w:val="both"/>
         <w:rPr>
           <w:rFonts w:asciiTheme="majorBidi" w:hAnsiTheme="majorBidi" w:cstheme="majorBidi"/>
           <w:sz w:val="28"/>
@@ -8051,6 +8028,7 @@
           <w:numId w:val="8"/>
         </w:numPr>
         <w:ind w:left="360"/>
+        <w:jc w:val="both"/>
         <w:rPr>
           <w:rFonts w:asciiTheme="majorBidi" w:hAnsiTheme="majorBidi" w:cstheme="majorBidi"/>
           <w:b/>
@@ -8134,6 +8112,7 @@
           <w:numId w:val="8"/>
         </w:numPr>
         <w:ind w:left="360"/>
+        <w:jc w:val="both"/>
         <w:rPr>
           <w:rFonts w:asciiTheme="majorBidi" w:hAnsiTheme="majorBidi" w:cstheme="majorBidi"/>
           <w:b/>
@@ -8217,6 +8196,7 @@
           <w:numId w:val="8"/>
         </w:numPr>
         <w:ind w:left="360"/>
+        <w:jc w:val="both"/>
         <w:rPr>
           <w:rFonts w:asciiTheme="majorBidi" w:hAnsiTheme="majorBidi" w:cstheme="majorBidi"/>
           <w:sz w:val="28"/>
@@ -8309,6 +8289,7 @@
         </w:numPr>
         <w:spacing w:after="100"/>
         <w:ind w:left="360"/>
+        <w:jc w:val="both"/>
         <w:rPr>
           <w:rFonts w:asciiTheme="majorBidi" w:hAnsiTheme="majorBidi" w:cstheme="majorBidi"/>
           <w:b/>
@@ -8363,6 +8344,7 @@
     <w:p>
       <w:pPr>
         <w:spacing w:after="80"/>
+        <w:jc w:val="both"/>
         <w:rPr>
           <w:rFonts w:asciiTheme="majorBidi" w:hAnsiTheme="majorBidi" w:cstheme="majorBidi"/>
           <w:b/>
@@ -8385,6 +8367,7 @@
     <w:p>
       <w:pPr>
         <w:spacing w:after="100"/>
+        <w:jc w:val="both"/>
         <w:rPr>
           <w:rFonts w:asciiTheme="majorBidi" w:hAnsiTheme="majorBidi" w:cstheme="majorBidi"/>
           <w:sz w:val="28"/>
@@ -8423,6 +8406,7 @@
     <w:p>
       <w:pPr>
         <w:spacing w:after="80"/>
+        <w:jc w:val="both"/>
         <w:rPr>
           <w:rFonts w:asciiTheme="majorBidi" w:hAnsiTheme="majorBidi" w:cstheme="majorBidi"/>
           <w:b/>
@@ -8450,6 +8434,7 @@
           <w:numId w:val="9"/>
         </w:numPr>
         <w:ind w:left="360"/>
+        <w:jc w:val="both"/>
         <w:rPr>
           <w:rFonts w:asciiTheme="majorBidi" w:hAnsiTheme="majorBidi" w:cstheme="majorBidi"/>
           <w:b/>
@@ -8476,6 +8461,7 @@
           <w:ilvl w:val="0"/>
           <w:numId w:val="10"/>
         </w:numPr>
+        <w:jc w:val="both"/>
         <w:rPr>
           <w:rFonts w:asciiTheme="majorBidi" w:hAnsiTheme="majorBidi" w:cstheme="majorBidi"/>
           <w:b/>
@@ -8507,6 +8493,7 @@
           <w:numId w:val="10"/>
         </w:numPr>
         <w:spacing w:after="80"/>
+        <w:jc w:val="both"/>
         <w:rPr>
           <w:rFonts w:asciiTheme="majorBidi" w:hAnsiTheme="majorBidi" w:cstheme="majorBidi"/>
           <w:b/>
@@ -8535,6 +8522,7 @@
       <w:pPr>
         <w:spacing w:after="100"/>
         <w:ind w:left="360"/>
+        <w:jc w:val="both"/>
         <w:rPr>
           <w:rFonts w:asciiTheme="majorBidi" w:hAnsiTheme="majorBidi" w:cstheme="majorBidi"/>
           <w:b/>
@@ -8592,6 +8580,7 @@
           <w:numId w:val="11"/>
         </w:numPr>
         <w:ind w:left="360"/>
+        <w:jc w:val="both"/>
         <w:rPr>
           <w:rFonts w:asciiTheme="majorBidi" w:hAnsiTheme="majorBidi" w:cstheme="majorBidi"/>
           <w:b/>
@@ -8618,6 +8607,7 @@
           <w:ilvl w:val="0"/>
           <w:numId w:val="12"/>
         </w:numPr>
+        <w:jc w:val="both"/>
         <w:rPr>
           <w:rFonts w:asciiTheme="majorBidi" w:hAnsiTheme="majorBidi" w:cstheme="majorBidi"/>
           <w:b/>
@@ -8662,6 +8652,7 @@
           <w:ilvl w:val="0"/>
           <w:numId w:val="12"/>
         </w:numPr>
+        <w:jc w:val="both"/>
         <w:rPr>
           <w:rFonts w:asciiTheme="majorBidi" w:hAnsiTheme="majorBidi" w:cstheme="majorBidi"/>
           <w:b/>
@@ -8693,6 +8684,7 @@
           <w:numId w:val="12"/>
         </w:numPr>
         <w:spacing w:after="80"/>
+        <w:jc w:val="both"/>
         <w:rPr>
           <w:rFonts w:asciiTheme="majorBidi" w:hAnsiTheme="majorBidi" w:cstheme="majorBidi"/>
           <w:b/>
@@ -8720,6 +8712,7 @@
       <w:pPr>
         <w:spacing w:after="100"/>
         <w:ind w:left="360"/>
+        <w:jc w:val="both"/>
         <w:rPr>
           <w:rFonts w:asciiTheme="majorBidi" w:hAnsiTheme="majorBidi" w:cstheme="majorBidi"/>
           <w:b/>
@@ -8777,6 +8770,7 @@
           <w:numId w:val="13"/>
         </w:numPr>
         <w:ind w:left="360"/>
+        <w:jc w:val="both"/>
         <w:rPr>
           <w:rFonts w:asciiTheme="majorBidi" w:hAnsiTheme="majorBidi" w:cstheme="majorBidi"/>
           <w:b/>
@@ -8803,6 +8797,7 @@
           <w:ilvl w:val="0"/>
           <w:numId w:val="14"/>
         </w:numPr>
+        <w:jc w:val="both"/>
         <w:rPr>
           <w:rFonts w:asciiTheme="majorBidi" w:hAnsiTheme="majorBidi" w:cstheme="majorBidi"/>
           <w:sz w:val="28"/>
@@ -8825,6 +8820,7 @@
           <w:ilvl w:val="0"/>
           <w:numId w:val="14"/>
         </w:numPr>
+        <w:jc w:val="both"/>
         <w:rPr>
           <w:rFonts w:asciiTheme="majorBidi" w:hAnsiTheme="majorBidi" w:cstheme="majorBidi"/>
           <w:sz w:val="28"/>
@@ -8847,6 +8843,7 @@
           <w:ilvl w:val="0"/>
           <w:numId w:val="14"/>
         </w:numPr>
+        <w:jc w:val="both"/>
         <w:rPr>
           <w:rFonts w:asciiTheme="majorBidi" w:hAnsiTheme="majorBidi" w:cstheme="majorBidi"/>
           <w:sz w:val="28"/>
@@ -8888,6 +8885,7 @@
           <w:numId w:val="14"/>
         </w:numPr>
         <w:spacing w:after="80"/>
+        <w:jc w:val="both"/>
         <w:rPr>
           <w:rFonts w:asciiTheme="majorBidi" w:hAnsiTheme="majorBidi" w:cstheme="majorBidi"/>
           <w:sz w:val="28"/>
@@ -8917,6 +8915,7 @@
       <w:pPr>
         <w:spacing w:after="100"/>
         <w:ind w:left="360"/>
+        <w:jc w:val="both"/>
         <w:rPr>
           <w:rFonts w:asciiTheme="majorBidi" w:hAnsiTheme="majorBidi" w:cstheme="majorBidi"/>
           <w:b/>
@@ -8974,6 +8973,7 @@
           <w:numId w:val="15"/>
         </w:numPr>
         <w:ind w:left="360"/>
+        <w:jc w:val="both"/>
         <w:rPr>
           <w:rFonts w:asciiTheme="majorBidi" w:hAnsiTheme="majorBidi" w:cstheme="majorBidi"/>
           <w:b/>
@@ -9000,6 +9000,7 @@
           <w:ilvl w:val="0"/>
           <w:numId w:val="16"/>
         </w:numPr>
+        <w:jc w:val="both"/>
         <w:rPr>
           <w:rFonts w:asciiTheme="majorBidi" w:hAnsiTheme="majorBidi" w:cstheme="majorBidi"/>
           <w:sz w:val="28"/>
@@ -9022,6 +9023,7 @@
           <w:ilvl w:val="0"/>
           <w:numId w:val="16"/>
         </w:numPr>
+        <w:jc w:val="both"/>
         <w:rPr>
           <w:rFonts w:asciiTheme="majorBidi" w:hAnsiTheme="majorBidi" w:cstheme="majorBidi"/>
           <w:sz w:val="28"/>
@@ -9044,6 +9046,7 @@
           <w:ilvl w:val="0"/>
           <w:numId w:val="16"/>
         </w:numPr>
+        <w:jc w:val="both"/>
         <w:rPr>
           <w:rFonts w:asciiTheme="majorBidi" w:hAnsiTheme="majorBidi" w:cstheme="majorBidi"/>
           <w:sz w:val="28"/>
@@ -9066,6 +9069,7 @@
           <w:ilvl w:val="0"/>
           <w:numId w:val="16"/>
         </w:numPr>
+        <w:jc w:val="both"/>
         <w:rPr>
           <w:rFonts w:asciiTheme="majorBidi" w:hAnsiTheme="majorBidi" w:cstheme="majorBidi"/>
           <w:sz w:val="28"/>
@@ -9689,42 +9693,47 @@
     </w:p>
     <w:p>
       <w:pPr>
-        <w:rPr>
-          <w:rFonts w:asciiTheme="majorBidi" w:hAnsiTheme="majorBidi" w:cstheme="majorBidi"/>
-          <w:sz w:val="28"/>
-          <w:szCs w:val="28"/>
-        </w:rPr>
-      </w:pPr>
-    </w:p>
-    <w:p>
-      <w:pPr>
-        <w:rPr>
-          <w:rFonts w:asciiTheme="majorBidi" w:hAnsiTheme="majorBidi" w:cstheme="majorBidi"/>
-          <w:sz w:val="28"/>
-          <w:szCs w:val="28"/>
-        </w:rPr>
-      </w:pPr>
-    </w:p>
-    <w:p>
-      <w:pPr>
-        <w:rPr>
-          <w:rFonts w:asciiTheme="majorBidi" w:hAnsiTheme="majorBidi" w:cstheme="majorBidi"/>
-          <w:sz w:val="28"/>
-          <w:szCs w:val="28"/>
-        </w:rPr>
-      </w:pPr>
-    </w:p>
-    <w:p>
-      <w:pPr>
-        <w:rPr>
-          <w:rFonts w:asciiTheme="majorBidi" w:hAnsiTheme="majorBidi" w:cstheme="majorBidi"/>
-          <w:sz w:val="28"/>
-          <w:szCs w:val="28"/>
-        </w:rPr>
-      </w:pPr>
-    </w:p>
-    <w:p>
-      <w:pPr>
+        <w:jc w:val="both"/>
+        <w:rPr>
+          <w:rFonts w:asciiTheme="majorBidi" w:hAnsiTheme="majorBidi" w:cstheme="majorBidi"/>
+          <w:sz w:val="28"/>
+          <w:szCs w:val="28"/>
+        </w:rPr>
+      </w:pPr>
+    </w:p>
+    <w:p>
+      <w:pPr>
+        <w:jc w:val="both"/>
+        <w:rPr>
+          <w:rFonts w:asciiTheme="majorBidi" w:hAnsiTheme="majorBidi" w:cstheme="majorBidi"/>
+          <w:sz w:val="28"/>
+          <w:szCs w:val="28"/>
+        </w:rPr>
+      </w:pPr>
+    </w:p>
+    <w:p>
+      <w:pPr>
+        <w:jc w:val="both"/>
+        <w:rPr>
+          <w:rFonts w:asciiTheme="majorBidi" w:hAnsiTheme="majorBidi" w:cstheme="majorBidi"/>
+          <w:sz w:val="28"/>
+          <w:szCs w:val="28"/>
+        </w:rPr>
+      </w:pPr>
+    </w:p>
+    <w:p>
+      <w:pPr>
+        <w:jc w:val="both"/>
+        <w:rPr>
+          <w:rFonts w:asciiTheme="majorBidi" w:hAnsiTheme="majorBidi" w:cstheme="majorBidi"/>
+          <w:sz w:val="28"/>
+          <w:szCs w:val="28"/>
+        </w:rPr>
+      </w:pPr>
+    </w:p>
+    <w:p>
+      <w:pPr>
+        <w:jc w:val="both"/>
         <w:rPr>
           <w:rFonts w:asciiTheme="majorBidi" w:hAnsiTheme="majorBidi" w:cstheme="majorBidi"/>
           <w:sz w:val="20"/>
@@ -9735,6 +9744,7 @@
     <w:p>
       <w:pPr>
         <w:spacing w:after="60"/>
+        <w:jc w:val="both"/>
         <w:rPr>
           <w:rFonts w:asciiTheme="majorBidi" w:hAnsiTheme="majorBidi" w:cstheme="majorBidi"/>
           <w:b/>
@@ -9757,6 +9767,7 @@
     <w:p>
       <w:pPr>
         <w:spacing w:after="80"/>
+        <w:jc w:val="both"/>
         <w:rPr>
           <w:rFonts w:asciiTheme="majorBidi" w:hAnsiTheme="majorBidi" w:cstheme="majorBidi"/>
           <w:sz w:val="28"/>
@@ -9780,6 +9791,7 @@
           <w:numId w:val="18"/>
         </w:numPr>
         <w:ind w:left="360"/>
+        <w:jc w:val="both"/>
         <w:rPr>
           <w:rFonts w:asciiTheme="majorBidi" w:hAnsiTheme="majorBidi" w:cstheme="majorBidi"/>
           <w:b/>
@@ -9806,6 +9818,7 @@
           <w:ilvl w:val="0"/>
           <w:numId w:val="19"/>
         </w:numPr>
+        <w:jc w:val="both"/>
         <w:rPr>
           <w:rFonts w:asciiTheme="majorBidi" w:hAnsiTheme="majorBidi" w:cstheme="majorBidi"/>
           <w:b/>
@@ -9888,6 +9901,7 @@
           <w:ilvl w:val="0"/>
           <w:numId w:val="19"/>
         </w:numPr>
+        <w:jc w:val="both"/>
         <w:rPr>
           <w:rFonts w:asciiTheme="majorBidi" w:hAnsiTheme="majorBidi" w:cstheme="majorBidi"/>
           <w:b/>
@@ -9966,6 +9980,7 @@
     <w:p>
       <w:pPr>
         <w:pStyle w:val="ListParagraph"/>
+        <w:jc w:val="both"/>
         <w:rPr>
           <w:rFonts w:asciiTheme="majorBidi" w:hAnsiTheme="majorBidi" w:cstheme="majorBidi"/>
           <w:b/>
@@ -9986,6 +10001,7 @@
         </w:numPr>
         <w:spacing w:after="60"/>
         <w:ind w:left="360"/>
+        <w:jc w:val="both"/>
         <w:rPr>
           <w:rFonts w:asciiTheme="majorBidi" w:hAnsiTheme="majorBidi" w:cstheme="majorBidi"/>
           <w:b/>
@@ -10009,6 +10025,7 @@
       <w:pPr>
         <w:spacing w:after="100"/>
         <w:ind w:left="360"/>
+        <w:jc w:val="both"/>
         <w:rPr>
           <w:rFonts w:asciiTheme="majorBidi" w:hAnsiTheme="majorBidi" w:cstheme="majorBidi"/>
           <w:b/>
@@ -10087,6 +10104,7 @@
     <w:p>
       <w:pPr>
         <w:spacing w:after="60"/>
+        <w:jc w:val="both"/>
         <w:rPr>
           <w:rFonts w:asciiTheme="majorBidi" w:hAnsiTheme="majorBidi" w:cstheme="majorBidi"/>
           <w:b/>
@@ -10114,6 +10132,7 @@
           <w:numId w:val="21"/>
         </w:numPr>
         <w:ind w:left="360"/>
+        <w:jc w:val="both"/>
         <w:rPr>
           <w:rFonts w:asciiTheme="majorBidi" w:hAnsiTheme="majorBidi" w:cstheme="majorBidi"/>
           <w:sz w:val="28"/>
@@ -10163,27 +10182,20 @@
           <w:numId w:val="21"/>
         </w:numPr>
         <w:ind w:left="360"/>
-        <w:rPr>
-          <w:rFonts w:asciiTheme="majorBidi" w:hAnsiTheme="majorBidi" w:cstheme="majorBidi"/>
-          <w:sz w:val="28"/>
-          <w:szCs w:val="28"/>
-        </w:rPr>
-      </w:pPr>
-      <w:r>
-        <w:rPr>
-          <w:rFonts w:asciiTheme="majorBidi" w:hAnsiTheme="majorBidi" w:cstheme="majorBidi"/>
-          <w:sz w:val="28"/>
-          <w:szCs w:val="28"/>
-        </w:rPr>
-        <w:t xml:space="preserve">- </w:t>
-      </w:r>
-      <w:r>
-        <w:rPr>
-          <w:rFonts w:asciiTheme="majorBidi" w:hAnsiTheme="majorBidi" w:cstheme="majorBidi"/>
-          <w:sz w:val="28"/>
-          <w:szCs w:val="28"/>
-        </w:rPr>
-        <w:t xml:space="preserve">→ </w:t>
+        <w:jc w:val="both"/>
+        <w:rPr>
+          <w:rFonts w:asciiTheme="majorBidi" w:hAnsiTheme="majorBidi" w:cstheme="majorBidi"/>
+          <w:sz w:val="28"/>
+          <w:szCs w:val="28"/>
+        </w:rPr>
+      </w:pPr>
+      <w:r>
+        <w:rPr>
+          <w:rFonts w:asciiTheme="majorBidi" w:hAnsiTheme="majorBidi" w:cstheme="majorBidi"/>
+          <w:sz w:val="28"/>
+          <w:szCs w:val="28"/>
+        </w:rPr>
+        <w:t xml:space="preserve">- → </w:t>
       </w:r>
       <w:r>
         <w:rPr>
@@ -10202,6 +10214,7 @@
           <w:numId w:val="21"/>
         </w:numPr>
         <w:ind w:left="360"/>
+        <w:jc w:val="both"/>
         <w:rPr>
           <w:rFonts w:asciiTheme="majorBidi" w:hAnsiTheme="majorBidi" w:cstheme="majorBidi"/>
           <w:sz w:val="28"/>
@@ -10233,6 +10246,7 @@
           <w:numId w:val="21"/>
         </w:numPr>
         <w:ind w:left="360"/>
+        <w:jc w:val="both"/>
         <w:rPr>
           <w:rFonts w:asciiTheme="majorBidi" w:hAnsiTheme="majorBidi" w:cstheme="majorBidi"/>
           <w:sz w:val="28"/>
@@ -10282,6 +10296,7 @@
           <w:numId w:val="21"/>
         </w:numPr>
         <w:ind w:left="360"/>
+        <w:jc w:val="both"/>
         <w:rPr>
           <w:rFonts w:asciiTheme="majorBidi" w:hAnsiTheme="majorBidi" w:cstheme="majorBidi"/>
           <w:sz w:val="28"/>
@@ -10332,6 +10347,7 @@
         </w:numPr>
         <w:spacing w:after="80"/>
         <w:ind w:left="360"/>
+        <w:jc w:val="both"/>
         <w:rPr>
           <w:rFonts w:asciiTheme="majorBidi" w:hAnsiTheme="majorBidi" w:cstheme="majorBidi"/>
           <w:sz w:val="28"/>
@@ -10376,6 +10392,7 @@
     <w:p>
       <w:pPr>
         <w:spacing w:after="80"/>
+        <w:jc w:val="both"/>
         <w:rPr>
           <w:rFonts w:asciiTheme="majorBidi" w:hAnsiTheme="majorBidi" w:cstheme="majorBidi"/>
           <w:sz w:val="28"/>
@@ -10397,6 +10414,7 @@
     <w:p>
       <w:pPr>
         <w:spacing w:after="100"/>
+        <w:jc w:val="both"/>
         <w:rPr>
           <w:rFonts w:asciiTheme="majorBidi" w:hAnsiTheme="majorBidi" w:cstheme="majorBidi"/>
           <w:b/>
@@ -10449,6 +10467,7 @@
     <w:p>
       <w:pPr>
         <w:spacing w:after="80"/>
+        <w:jc w:val="both"/>
         <w:rPr>
           <w:rFonts w:asciiTheme="majorBidi" w:hAnsiTheme="majorBidi" w:cstheme="majorBidi"/>
           <w:b/>
@@ -10471,6 +10490,7 @@
     <w:p>
       <w:pPr>
         <w:spacing w:after="60"/>
+        <w:jc w:val="both"/>
         <w:rPr>
           <w:rFonts w:asciiTheme="majorBidi" w:hAnsiTheme="majorBidi" w:cstheme="majorBidi"/>
           <w:b/>
@@ -10498,19 +10518,32 @@
           <w:numId w:val="22"/>
         </w:numPr>
         <w:ind w:left="360"/>
-        <w:rPr>
-          <w:rFonts w:asciiTheme="majorBidi" w:hAnsiTheme="majorBidi" w:cstheme="majorBidi"/>
-          <w:sz w:val="28"/>
-          <w:szCs w:val="28"/>
-        </w:rPr>
-      </w:pPr>
-      <w:r>
-        <w:rPr>
-          <w:rFonts w:asciiTheme="majorBidi" w:hAnsiTheme="majorBidi" w:cstheme="majorBidi"/>
-          <w:sz w:val="28"/>
-          <w:szCs w:val="28"/>
-        </w:rPr>
-        <w:t>parentheses (...)</w:t>
+        <w:jc w:val="both"/>
+        <w:rPr>
+          <w:rFonts w:asciiTheme="majorBidi" w:hAnsiTheme="majorBidi" w:cstheme="majorBidi"/>
+          <w:sz w:val="28"/>
+          <w:szCs w:val="28"/>
+        </w:rPr>
+      </w:pPr>
+      <w:r>
+        <w:rPr>
+          <w:rFonts w:asciiTheme="majorBidi" w:hAnsiTheme="majorBidi" w:cstheme="majorBidi"/>
+          <w:b/>
+          <w:bCs/>
+          <w:i/>
+          <w:iCs/>
+          <w:sz w:val="28"/>
+          <w:szCs w:val="28"/>
+        </w:rPr>
+        <w:t>parentheses</w:t>
+      </w:r>
+      <w:r>
+        <w:rPr>
+          <w:rFonts w:asciiTheme="majorBidi" w:hAnsiTheme="majorBidi" w:cstheme="majorBidi"/>
+          <w:sz w:val="28"/>
+          <w:szCs w:val="28"/>
+        </w:rPr>
+        <w:t xml:space="preserve"> (...)</w:t>
       </w:r>
     </w:p>
     <w:p>
@@ -10521,15 +10554,24 @@
           <w:numId w:val="22"/>
         </w:numPr>
         <w:ind w:left="360"/>
-        <w:rPr>
-          <w:rFonts w:asciiTheme="majorBidi" w:hAnsiTheme="majorBidi" w:cstheme="majorBidi"/>
-          <w:sz w:val="28"/>
-          <w:szCs w:val="28"/>
-        </w:rPr>
-      </w:pPr>
-      <w:r>
-        <w:rPr>
-          <w:rFonts w:asciiTheme="majorBidi" w:hAnsiTheme="majorBidi" w:cstheme="majorBidi"/>
+        <w:jc w:val="both"/>
+        <w:rPr>
+          <w:rFonts w:asciiTheme="majorBidi" w:hAnsiTheme="majorBidi" w:cstheme="majorBidi"/>
+          <w:b/>
+          <w:bCs/>
+          <w:i/>
+          <w:iCs/>
+          <w:sz w:val="28"/>
+          <w:szCs w:val="28"/>
+        </w:rPr>
+      </w:pPr>
+      <w:r>
+        <w:rPr>
+          <w:rFonts w:asciiTheme="majorBidi" w:hAnsiTheme="majorBidi" w:cstheme="majorBidi"/>
+          <w:b/>
+          <w:bCs/>
+          <w:i/>
+          <w:iCs/>
           <w:sz w:val="28"/>
           <w:szCs w:val="28"/>
         </w:rPr>
@@ -10544,15 +10586,24 @@
           <w:numId w:val="22"/>
         </w:numPr>
         <w:ind w:left="360"/>
-        <w:rPr>
-          <w:rFonts w:asciiTheme="majorBidi" w:hAnsiTheme="majorBidi" w:cstheme="majorBidi"/>
-          <w:sz w:val="28"/>
-          <w:szCs w:val="28"/>
-        </w:rPr>
-      </w:pPr>
-      <w:r>
-        <w:rPr>
-          <w:rFonts w:asciiTheme="majorBidi" w:hAnsiTheme="majorBidi" w:cstheme="majorBidi"/>
+        <w:jc w:val="both"/>
+        <w:rPr>
+          <w:rFonts w:asciiTheme="majorBidi" w:hAnsiTheme="majorBidi" w:cstheme="majorBidi"/>
+          <w:b/>
+          <w:bCs/>
+          <w:i/>
+          <w:iCs/>
+          <w:sz w:val="28"/>
+          <w:szCs w:val="28"/>
+        </w:rPr>
+      </w:pPr>
+      <w:r>
+        <w:rPr>
+          <w:rFonts w:asciiTheme="majorBidi" w:hAnsiTheme="majorBidi" w:cstheme="majorBidi"/>
+          <w:b/>
+          <w:bCs/>
+          <w:i/>
+          <w:iCs/>
           <w:sz w:val="28"/>
           <w:szCs w:val="28"/>
         </w:rPr>
@@ -10568,64 +10619,7 @@
         </w:numPr>
         <w:spacing w:after="100"/>
         <w:ind w:left="360"/>
-        <w:rPr>
-          <w:rFonts w:asciiTheme="majorBidi" w:hAnsiTheme="majorBidi" w:cstheme="majorBidi"/>
-          <w:sz w:val="28"/>
-          <w:szCs w:val="28"/>
-        </w:rPr>
-      </w:pPr>
-      <w:r>
-        <w:rPr>
-          <w:rFonts w:asciiTheme="majorBidi" w:hAnsiTheme="majorBidi" w:cstheme="majorBidi"/>
-          <w:sz w:val="28"/>
-          <w:szCs w:val="28"/>
-        </w:rPr>
-        <w:t>or</w:t>
-      </w:r>
-    </w:p>
-    <w:p>
-      <w:pPr>
-        <w:rPr>
-          <w:rFonts w:asciiTheme="majorBidi" w:hAnsiTheme="majorBidi" w:cstheme="majorBidi"/>
-          <w:sz w:val="28"/>
-          <w:szCs w:val="28"/>
-        </w:rPr>
-      </w:pPr>
-      <w:proofErr w:type="gramStart"/>
-      <w:r>
-        <w:rPr>
-          <w:rFonts w:asciiTheme="majorBidi" w:hAnsiTheme="majorBidi" w:cstheme="majorBidi"/>
-          <w:sz w:val="28"/>
-          <w:szCs w:val="28"/>
-        </w:rPr>
-        <w:t>So</w:t>
-      </w:r>
-      <w:proofErr w:type="gramEnd"/>
-      <w:r>
-        <w:rPr>
-          <w:rFonts w:asciiTheme="majorBidi" w:hAnsiTheme="majorBidi" w:cstheme="majorBidi"/>
-          <w:sz w:val="28"/>
-          <w:szCs w:val="28"/>
-        </w:rPr>
-        <w:t xml:space="preserve"> if in doubt, add parentheses</w:t>
-      </w:r>
-      <w:r>
-        <w:rPr>
-          <w:rFonts w:asciiTheme="majorBidi" w:hAnsiTheme="majorBidi" w:cstheme="majorBidi"/>
-          <w:sz w:val="28"/>
-          <w:szCs w:val="28"/>
-        </w:rPr>
-        <w:t xml:space="preserve"> </w:t>
-      </w:r>
-      <w:r>
-        <w:rPr>
-          <w:rFonts w:asciiTheme="majorBidi" w:hAnsiTheme="majorBidi" w:cstheme="majorBidi"/>
-          <w:sz w:val="28"/>
-          <w:szCs w:val="28"/>
-        </w:rPr>
-        <w:t xml:space="preserve">→ </w:t>
-      </w:r>
-      <w:r>
+        <w:jc w:val="both"/>
         <w:rPr>
           <w:rFonts w:asciiTheme="majorBidi" w:hAnsiTheme="majorBidi" w:cstheme="majorBidi"/>
           <w:b/>
@@ -10635,7 +10629,2092 @@
           <w:sz w:val="28"/>
           <w:szCs w:val="28"/>
         </w:rPr>
+      </w:pPr>
+      <w:r>
+        <w:rPr>
+          <w:rFonts w:asciiTheme="majorBidi" w:hAnsiTheme="majorBidi" w:cstheme="majorBidi"/>
+          <w:b/>
+          <w:bCs/>
+          <w:i/>
+          <w:iCs/>
+          <w:sz w:val="28"/>
+          <w:szCs w:val="28"/>
+        </w:rPr>
+        <w:t>or</w:t>
+      </w:r>
+    </w:p>
+    <w:p>
+      <w:pPr>
+        <w:jc w:val="both"/>
+        <w:rPr>
+          <w:rFonts w:asciiTheme="majorBidi" w:hAnsiTheme="majorBidi" w:cstheme="majorBidi"/>
+          <w:b/>
+          <w:bCs/>
+          <w:i/>
+          <w:iCs/>
+          <w:sz w:val="28"/>
+          <w:szCs w:val="28"/>
+        </w:rPr>
+      </w:pPr>
+      <w:proofErr w:type="gramStart"/>
+      <w:r>
+        <w:rPr>
+          <w:rFonts w:asciiTheme="majorBidi" w:hAnsiTheme="majorBidi" w:cstheme="majorBidi"/>
+          <w:sz w:val="28"/>
+          <w:szCs w:val="28"/>
+        </w:rPr>
+        <w:t>So</w:t>
+      </w:r>
+      <w:proofErr w:type="gramEnd"/>
+      <w:r>
+        <w:rPr>
+          <w:rFonts w:asciiTheme="majorBidi" w:hAnsiTheme="majorBidi" w:cstheme="majorBidi"/>
+          <w:sz w:val="28"/>
+          <w:szCs w:val="28"/>
+        </w:rPr>
+        <w:t xml:space="preserve"> if in doubt, add parentheses</w:t>
+      </w:r>
+      <w:r>
+        <w:rPr>
+          <w:rFonts w:asciiTheme="majorBidi" w:hAnsiTheme="majorBidi" w:cstheme="majorBidi"/>
+          <w:sz w:val="28"/>
+          <w:szCs w:val="28"/>
+        </w:rPr>
+        <w:t xml:space="preserve"> </w:t>
+      </w:r>
+      <w:r>
+        <w:rPr>
+          <w:rFonts w:asciiTheme="majorBidi" w:hAnsiTheme="majorBidi" w:cstheme="majorBidi"/>
+          <w:sz w:val="28"/>
+          <w:szCs w:val="28"/>
+        </w:rPr>
+        <w:t xml:space="preserve">→ </w:t>
+      </w:r>
+      <w:r>
+        <w:rPr>
+          <w:rFonts w:asciiTheme="majorBidi" w:hAnsiTheme="majorBidi" w:cstheme="majorBidi"/>
+          <w:b/>
+          <w:bCs/>
+          <w:i/>
+          <w:iCs/>
+          <w:sz w:val="28"/>
+          <w:szCs w:val="28"/>
+        </w:rPr>
         <w:t>when: (a and b) or c</w:t>
+      </w:r>
+    </w:p>
+    <w:p>
+      <w:pPr>
+        <w:spacing w:after="80"/>
+        <w:jc w:val="both"/>
+        <w:rPr>
+          <w:rFonts w:asciiTheme="majorBidi" w:hAnsiTheme="majorBidi" w:cstheme="majorBidi"/>
+          <w:b/>
+          <w:bCs/>
+          <w:sz w:val="36"/>
+          <w:szCs w:val="36"/>
+        </w:rPr>
+      </w:pPr>
+      <w:r>
+        <w:rPr>
+          <w:rFonts w:asciiTheme="majorBidi" w:hAnsiTheme="majorBidi" w:cstheme="majorBidi"/>
+          <w:b/>
+          <w:bCs/>
+          <w:sz w:val="36"/>
+          <w:szCs w:val="36"/>
+        </w:rPr>
+        <w:t>The Scenario</w:t>
+      </w:r>
+    </w:p>
+    <w:p>
+      <w:pPr>
+        <w:jc w:val="both"/>
+        <w:rPr>
+          <w:rFonts w:asciiTheme="majorBidi" w:hAnsiTheme="majorBidi" w:cstheme="majorBidi"/>
+          <w:sz w:val="28"/>
+          <w:szCs w:val="28"/>
+        </w:rPr>
+      </w:pPr>
+      <w:r>
+        <w:rPr>
+          <w:rFonts w:asciiTheme="majorBidi" w:hAnsiTheme="majorBidi" w:cstheme="majorBidi"/>
+          <w:noProof/>
+          <w:sz w:val="28"/>
+          <w:szCs w:val="28"/>
+        </w:rPr>
+        <mc:AlternateContent>
+          <mc:Choice Requires="wps">
+            <w:drawing>
+              <wp:anchor distT="0" distB="0" distL="114300" distR="114300" simplePos="0" relativeHeight="251669504" behindDoc="0" locked="0" layoutInCell="1" allowOverlap="1" wp14:anchorId="084DE8E2" wp14:editId="5E6D6BCC">
+                <wp:simplePos x="0" y="0"/>
+                <wp:positionH relativeFrom="margin">
+                  <wp:align>left</wp:align>
+                </wp:positionH>
+                <wp:positionV relativeFrom="paragraph">
+                  <wp:posOffset>963295</wp:posOffset>
+                </wp:positionV>
+                <wp:extent cx="4400550" cy="1238250"/>
+                <wp:effectExtent l="0" t="0" r="19050" b="19050"/>
+                <wp:wrapNone/>
+                <wp:docPr id="6" name="Rectangle 6"/>
+                <wp:cNvGraphicFramePr/>
+                <a:graphic xmlns:a="http://schemas.openxmlformats.org/drawingml/2006/main">
+                  <a:graphicData uri="http://schemas.microsoft.com/office/word/2010/wordprocessingShape">
+                    <wps:wsp>
+                      <wps:cNvSpPr/>
+                      <wps:spPr>
+                        <a:xfrm>
+                          <a:off x="0" y="0"/>
+                          <a:ext cx="4400550" cy="1238250"/>
+                        </a:xfrm>
+                        <a:prstGeom prst="rect">
+                          <a:avLst/>
+                        </a:prstGeom>
+                      </wps:spPr>
+                      <wps:style>
+                        <a:lnRef idx="2">
+                          <a:schemeClr val="dk1">
+                            <a:shade val="15000"/>
+                          </a:schemeClr>
+                        </a:lnRef>
+                        <a:fillRef idx="1">
+                          <a:schemeClr val="dk1"/>
+                        </a:fillRef>
+                        <a:effectRef idx="0">
+                          <a:schemeClr val="dk1"/>
+                        </a:effectRef>
+                        <a:fontRef idx="minor">
+                          <a:schemeClr val="lt1"/>
+                        </a:fontRef>
+                      </wps:style>
+                      <wps:txbx>
+                        <w:txbxContent>
+                          <w:p>
+                            <w:pPr>
+                              <w:spacing w:after="0"/>
+                              <w:rPr>
+                                <w:rFonts w:asciiTheme="majorBidi" w:hAnsiTheme="majorBidi" w:cstheme="majorBidi"/>
+                                <w:b/>
+                                <w:bCs/>
+                                <w:i/>
+                                <w:iCs/>
+                                <w:sz w:val="28"/>
+                                <w:szCs w:val="28"/>
+                              </w:rPr>
+                            </w:pPr>
+                            <w:r>
+                              <w:rPr>
+                                <w:rFonts w:asciiTheme="majorBidi" w:hAnsiTheme="majorBidi" w:cstheme="majorBidi"/>
+                                <w:b/>
+                                <w:bCs/>
+                                <w:i/>
+                                <w:iCs/>
+                                <w:sz w:val="28"/>
+                                <w:szCs w:val="28"/>
+                              </w:rPr>
+                              <w:t>- name: Perform critical database cleanup</w:t>
+                            </w:r>
+                          </w:p>
+                          <w:p>
+                            <w:pPr>
+                              <w:spacing w:after="0"/>
+                              <w:rPr>
+                                <w:rFonts w:asciiTheme="majorBidi" w:hAnsiTheme="majorBidi" w:cstheme="majorBidi"/>
+                                <w:b/>
+                                <w:bCs/>
+                                <w:i/>
+                                <w:iCs/>
+                                <w:sz w:val="28"/>
+                                <w:szCs w:val="28"/>
+                              </w:rPr>
+                            </w:pPr>
+                            <w:r>
+                              <w:rPr>
+                                <w:rFonts w:asciiTheme="majorBidi" w:hAnsiTheme="majorBidi" w:cstheme="majorBidi"/>
+                                <w:b/>
+                                <w:bCs/>
+                                <w:i/>
+                                <w:iCs/>
+                                <w:sz w:val="28"/>
+                                <w:szCs w:val="28"/>
+                              </w:rPr>
+                              <w:t xml:space="preserve">  command: /usr/local/bin/db_cleanup.sh</w:t>
+                            </w:r>
+                          </w:p>
+                          <w:p>
+                            <w:pPr>
+                              <w:spacing w:after="0"/>
+                              <w:rPr>
+                                <w:rFonts w:asciiTheme="majorBidi" w:hAnsiTheme="majorBidi" w:cstheme="majorBidi"/>
+                                <w:b/>
+                                <w:bCs/>
+                                <w:i/>
+                                <w:iCs/>
+                                <w:sz w:val="28"/>
+                                <w:szCs w:val="28"/>
+                              </w:rPr>
+                            </w:pPr>
+                            <w:r>
+                              <w:rPr>
+                                <w:rFonts w:asciiTheme="majorBidi" w:hAnsiTheme="majorBidi" w:cstheme="majorBidi"/>
+                                <w:b/>
+                                <w:bCs/>
+                                <w:i/>
+                                <w:iCs/>
+                                <w:sz w:val="28"/>
+                                <w:szCs w:val="28"/>
+                              </w:rPr>
+                              <w:t xml:space="preserve">  when: &gt;</w:t>
+                            </w:r>
+                          </w:p>
+                          <w:p>
+                            <w:pPr>
+                              <w:spacing w:after="0"/>
+                              <w:rPr>
+                                <w:rFonts w:asciiTheme="majorBidi" w:hAnsiTheme="majorBidi" w:cstheme="majorBidi"/>
+                                <w:b/>
+                                <w:bCs/>
+                                <w:i/>
+                                <w:iCs/>
+                                <w:sz w:val="28"/>
+                                <w:szCs w:val="28"/>
+                              </w:rPr>
+                            </w:pPr>
+                            <w:r>
+                              <w:rPr>
+                                <w:rFonts w:asciiTheme="majorBidi" w:hAnsiTheme="majorBidi" w:cstheme="majorBidi"/>
+                                <w:b/>
+                                <w:bCs/>
+                                <w:i/>
+                                <w:iCs/>
+                                <w:sz w:val="28"/>
+                                <w:szCs w:val="28"/>
+                              </w:rPr>
+                              <w:t xml:space="preserve">    (</w:t>
+                            </w:r>
+                            <w:proofErr w:type="spellStart"/>
+                            <w:r>
+                              <w:rPr>
+                                <w:rFonts w:asciiTheme="majorBidi" w:hAnsiTheme="majorBidi" w:cstheme="majorBidi"/>
+                                <w:b/>
+                                <w:bCs/>
+                                <w:i/>
+                                <w:iCs/>
+                                <w:sz w:val="28"/>
+                                <w:szCs w:val="28"/>
+                              </w:rPr>
+                              <w:t>inventory_hostname</w:t>
+                            </w:r>
+                            <w:proofErr w:type="spellEnd"/>
+                            <w:r>
+                              <w:rPr>
+                                <w:rFonts w:asciiTheme="majorBidi" w:hAnsiTheme="majorBidi" w:cstheme="majorBidi"/>
+                                <w:b/>
+                                <w:bCs/>
+                                <w:i/>
+                                <w:iCs/>
+                                <w:sz w:val="28"/>
+                                <w:szCs w:val="28"/>
+                              </w:rPr>
+                              <w:t xml:space="preserve"> in </w:t>
+                            </w:r>
+                            <w:proofErr w:type="spellStart"/>
+                            <w:proofErr w:type="gramStart"/>
+                            <w:r>
+                              <w:rPr>
+                                <w:rFonts w:asciiTheme="majorBidi" w:hAnsiTheme="majorBidi" w:cstheme="majorBidi"/>
+                                <w:b/>
+                                <w:bCs/>
+                                <w:i/>
+                                <w:iCs/>
+                                <w:sz w:val="28"/>
+                                <w:szCs w:val="28"/>
+                              </w:rPr>
+                              <w:t>groups.get</w:t>
+                            </w:r>
+                            <w:proofErr w:type="spellEnd"/>
+                            <w:r>
+                              <w:rPr>
+                                <w:rFonts w:asciiTheme="majorBidi" w:hAnsiTheme="majorBidi" w:cstheme="majorBidi"/>
+                                <w:b/>
+                                <w:bCs/>
+                                <w:i/>
+                                <w:iCs/>
+                                <w:sz w:val="28"/>
+                                <w:szCs w:val="28"/>
+                              </w:rPr>
+                              <w:t>(</w:t>
+                            </w:r>
+                            <w:proofErr w:type="gramEnd"/>
+                            <w:r>
+                              <w:rPr>
+                                <w:rFonts w:asciiTheme="majorBidi" w:hAnsiTheme="majorBidi" w:cstheme="majorBidi"/>
+                                <w:b/>
+                                <w:bCs/>
+                                <w:i/>
+                                <w:iCs/>
+                                <w:sz w:val="28"/>
+                                <w:szCs w:val="28"/>
+                              </w:rPr>
+                              <w:t>'</w:t>
+                            </w:r>
+                            <w:proofErr w:type="spellStart"/>
+                            <w:r>
+                              <w:rPr>
+                                <w:rFonts w:asciiTheme="majorBidi" w:hAnsiTheme="majorBidi" w:cstheme="majorBidi"/>
+                                <w:b/>
+                                <w:bCs/>
+                                <w:i/>
+                                <w:iCs/>
+                                <w:sz w:val="28"/>
+                                <w:szCs w:val="28"/>
+                              </w:rPr>
+                              <w:t>db_servers</w:t>
+                            </w:r>
+                            <w:proofErr w:type="spellEnd"/>
+                            <w:r>
+                              <w:rPr>
+                                <w:rFonts w:asciiTheme="majorBidi" w:hAnsiTheme="majorBidi" w:cstheme="majorBidi"/>
+                                <w:b/>
+                                <w:bCs/>
+                                <w:i/>
+                                <w:iCs/>
+                                <w:sz w:val="28"/>
+                                <w:szCs w:val="28"/>
+                              </w:rPr>
+                              <w:t>', [])) or</w:t>
+                            </w:r>
+                          </w:p>
+                          <w:p>
+                            <w:pPr>
+                              <w:spacing w:after="0"/>
+                              <w:rPr>
+                                <w:rFonts w:asciiTheme="majorBidi" w:hAnsiTheme="majorBidi" w:cstheme="majorBidi"/>
+                                <w:b/>
+                                <w:bCs/>
+                                <w:i/>
+                                <w:iCs/>
+                                <w:sz w:val="28"/>
+                                <w:szCs w:val="28"/>
+                              </w:rPr>
+                            </w:pPr>
+                            <w:r>
+                              <w:rPr>
+                                <w:rFonts w:asciiTheme="majorBidi" w:hAnsiTheme="majorBidi" w:cstheme="majorBidi"/>
+                                <w:b/>
+                                <w:bCs/>
+                                <w:i/>
+                                <w:iCs/>
+                                <w:sz w:val="28"/>
+                                <w:szCs w:val="28"/>
+                              </w:rPr>
+                              <w:t xml:space="preserve">    (</w:t>
+                            </w:r>
+                            <w:proofErr w:type="spellStart"/>
+                            <w:r>
+                              <w:rPr>
+                                <w:rFonts w:asciiTheme="majorBidi" w:hAnsiTheme="majorBidi" w:cstheme="majorBidi"/>
+                                <w:b/>
+                                <w:bCs/>
+                                <w:i/>
+                                <w:iCs/>
+                                <w:sz w:val="28"/>
+                                <w:szCs w:val="28"/>
+                              </w:rPr>
+                              <w:t>force_cleanup</w:t>
+                            </w:r>
+                            <w:proofErr w:type="spellEnd"/>
+                            <w:r>
+                              <w:rPr>
+                                <w:rFonts w:asciiTheme="majorBidi" w:hAnsiTheme="majorBidi" w:cstheme="majorBidi"/>
+                                <w:b/>
+                                <w:bCs/>
+                                <w:i/>
+                                <w:iCs/>
+                                <w:sz w:val="28"/>
+                                <w:szCs w:val="28"/>
+                              </w:rPr>
+                              <w:t xml:space="preserve"> | default(false) | bool)</w:t>
+                            </w:r>
+                          </w:p>
+                          <w:p>
+                            <w:pPr>
+                              <w:jc w:val="center"/>
+                            </w:pPr>
+                          </w:p>
+                        </w:txbxContent>
+                      </wps:txbx>
+                      <wps:bodyPr rot="0" spcFirstLastPara="0" vertOverflow="overflow" horzOverflow="overflow" vert="horz" wrap="square" lIns="91440" tIns="45720" rIns="91440" bIns="45720" numCol="1" spcCol="0" rtlCol="0" fromWordArt="0" anchor="ctr" anchorCtr="0" forceAA="0" compatLnSpc="1">
+                        <a:prstTxWarp prst="textNoShape">
+                          <a:avLst/>
+                        </a:prstTxWarp>
+                        <a:noAutofit/>
+                      </wps:bodyPr>
+                    </wps:wsp>
+                  </a:graphicData>
+                </a:graphic>
+                <wp14:sizeRelH relativeFrom="margin">
+                  <wp14:pctWidth>0</wp14:pctWidth>
+                </wp14:sizeRelH>
+                <wp14:sizeRelV relativeFrom="margin">
+                  <wp14:pctHeight>0</wp14:pctHeight>
+                </wp14:sizeRelV>
+              </wp:anchor>
+            </w:drawing>
+          </mc:Choice>
+          <mc:Fallback>
+            <w:pict>
+              <v:rect w14:anchorId="084DE8E2" id="_x0000_s1036" style="position:absolute;left:0;text-align:left;margin-left:0;margin-top:75.85pt;width:346.5pt;height:97.5pt;z-index:251669504;visibility:visible;mso-wrap-style:square;mso-width-percent:0;mso-height-percent:0;mso-wrap-distance-left:9pt;mso-wrap-distance-top:0;mso-wrap-distance-right:9pt;mso-wrap-distance-bottom:0;mso-position-horizontal:left;mso-position-horizontal-relative:margin;mso-position-vertical:absolute;mso-position-vertical-relative:text;mso-width-percent:0;mso-height-percent:0;mso-width-relative:margin;mso-height-relative:margin;v-text-anchor:middle" o:gfxdata="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" fillcolor="black [3200]" strokecolor="black [480]" strokeweight="1pt">
+                <v:textbox>
+                  <w:txbxContent>
+                    <w:p>
+                      <w:pPr>
+                        <w:spacing w:after="0"/>
+                        <w:rPr>
+                          <w:rFonts w:asciiTheme="majorBidi" w:hAnsiTheme="majorBidi" w:cstheme="majorBidi"/>
+                          <w:b/>
+                          <w:bCs/>
+                          <w:i/>
+                          <w:iCs/>
+                          <w:sz w:val="28"/>
+                          <w:szCs w:val="28"/>
+                        </w:rPr>
+                      </w:pPr>
+                      <w:r>
+                        <w:rPr>
+                          <w:rFonts w:asciiTheme="majorBidi" w:hAnsiTheme="majorBidi" w:cstheme="majorBidi"/>
+                          <w:b/>
+                          <w:bCs/>
+                          <w:i/>
+                          <w:iCs/>
+                          <w:sz w:val="28"/>
+                          <w:szCs w:val="28"/>
+                        </w:rPr>
+                        <w:t>- name: Perform critical database cleanup</w:t>
+                      </w:r>
+                    </w:p>
+                    <w:p>
+                      <w:pPr>
+                        <w:spacing w:after="0"/>
+                        <w:rPr>
+                          <w:rFonts w:asciiTheme="majorBidi" w:hAnsiTheme="majorBidi" w:cstheme="majorBidi"/>
+                          <w:b/>
+                          <w:bCs/>
+                          <w:i/>
+                          <w:iCs/>
+                          <w:sz w:val="28"/>
+                          <w:szCs w:val="28"/>
+                        </w:rPr>
+                      </w:pPr>
+                      <w:r>
+                        <w:rPr>
+                          <w:rFonts w:asciiTheme="majorBidi" w:hAnsiTheme="majorBidi" w:cstheme="majorBidi"/>
+                          <w:b/>
+                          <w:bCs/>
+                          <w:i/>
+                          <w:iCs/>
+                          <w:sz w:val="28"/>
+                          <w:szCs w:val="28"/>
+                        </w:rPr>
+                        <w:t xml:space="preserve">  command: /usr/local/bin/db_cleanup.sh</w:t>
+                      </w:r>
+                    </w:p>
+                    <w:p>
+                      <w:pPr>
+                        <w:spacing w:after="0"/>
+                        <w:rPr>
+                          <w:rFonts w:asciiTheme="majorBidi" w:hAnsiTheme="majorBidi" w:cstheme="majorBidi"/>
+                          <w:b/>
+                          <w:bCs/>
+                          <w:i/>
+                          <w:iCs/>
+                          <w:sz w:val="28"/>
+                          <w:szCs w:val="28"/>
+                        </w:rPr>
+                      </w:pPr>
+                      <w:r>
+                        <w:rPr>
+                          <w:rFonts w:asciiTheme="majorBidi" w:hAnsiTheme="majorBidi" w:cstheme="majorBidi"/>
+                          <w:b/>
+                          <w:bCs/>
+                          <w:i/>
+                          <w:iCs/>
+                          <w:sz w:val="28"/>
+                          <w:szCs w:val="28"/>
+                        </w:rPr>
+                        <w:t xml:space="preserve">  when: &gt;</w:t>
+                      </w:r>
+                    </w:p>
+                    <w:p>
+                      <w:pPr>
+                        <w:spacing w:after="0"/>
+                        <w:rPr>
+                          <w:rFonts w:asciiTheme="majorBidi" w:hAnsiTheme="majorBidi" w:cstheme="majorBidi"/>
+                          <w:b/>
+                          <w:bCs/>
+                          <w:i/>
+                          <w:iCs/>
+                          <w:sz w:val="28"/>
+                          <w:szCs w:val="28"/>
+                        </w:rPr>
+                      </w:pPr>
+                      <w:r>
+                        <w:rPr>
+                          <w:rFonts w:asciiTheme="majorBidi" w:hAnsiTheme="majorBidi" w:cstheme="majorBidi"/>
+                          <w:b/>
+                          <w:bCs/>
+                          <w:i/>
+                          <w:iCs/>
+                          <w:sz w:val="28"/>
+                          <w:szCs w:val="28"/>
+                        </w:rPr>
+                        <w:t xml:space="preserve">    (</w:t>
+                      </w:r>
+                      <w:proofErr w:type="spellStart"/>
+                      <w:r>
+                        <w:rPr>
+                          <w:rFonts w:asciiTheme="majorBidi" w:hAnsiTheme="majorBidi" w:cstheme="majorBidi"/>
+                          <w:b/>
+                          <w:bCs/>
+                          <w:i/>
+                          <w:iCs/>
+                          <w:sz w:val="28"/>
+                          <w:szCs w:val="28"/>
+                        </w:rPr>
+                        <w:t>inventory_hostname</w:t>
+                      </w:r>
+                      <w:proofErr w:type="spellEnd"/>
+                      <w:r>
+                        <w:rPr>
+                          <w:rFonts w:asciiTheme="majorBidi" w:hAnsiTheme="majorBidi" w:cstheme="majorBidi"/>
+                          <w:b/>
+                          <w:bCs/>
+                          <w:i/>
+                          <w:iCs/>
+                          <w:sz w:val="28"/>
+                          <w:szCs w:val="28"/>
+                        </w:rPr>
+                        <w:t xml:space="preserve"> in </w:t>
+                      </w:r>
+                      <w:proofErr w:type="spellStart"/>
+                      <w:proofErr w:type="gramStart"/>
+                      <w:r>
+                        <w:rPr>
+                          <w:rFonts w:asciiTheme="majorBidi" w:hAnsiTheme="majorBidi" w:cstheme="majorBidi"/>
+                          <w:b/>
+                          <w:bCs/>
+                          <w:i/>
+                          <w:iCs/>
+                          <w:sz w:val="28"/>
+                          <w:szCs w:val="28"/>
+                        </w:rPr>
+                        <w:t>groups.get</w:t>
+                      </w:r>
+                      <w:proofErr w:type="spellEnd"/>
+                      <w:r>
+                        <w:rPr>
+                          <w:rFonts w:asciiTheme="majorBidi" w:hAnsiTheme="majorBidi" w:cstheme="majorBidi"/>
+                          <w:b/>
+                          <w:bCs/>
+                          <w:i/>
+                          <w:iCs/>
+                          <w:sz w:val="28"/>
+                          <w:szCs w:val="28"/>
+                        </w:rPr>
+                        <w:t>(</w:t>
+                      </w:r>
+                      <w:proofErr w:type="gramEnd"/>
+                      <w:r>
+                        <w:rPr>
+                          <w:rFonts w:asciiTheme="majorBidi" w:hAnsiTheme="majorBidi" w:cstheme="majorBidi"/>
+                          <w:b/>
+                          <w:bCs/>
+                          <w:i/>
+                          <w:iCs/>
+                          <w:sz w:val="28"/>
+                          <w:szCs w:val="28"/>
+                        </w:rPr>
+                        <w:t>'</w:t>
+                      </w:r>
+                      <w:proofErr w:type="spellStart"/>
+                      <w:r>
+                        <w:rPr>
+                          <w:rFonts w:asciiTheme="majorBidi" w:hAnsiTheme="majorBidi" w:cstheme="majorBidi"/>
+                          <w:b/>
+                          <w:bCs/>
+                          <w:i/>
+                          <w:iCs/>
+                          <w:sz w:val="28"/>
+                          <w:szCs w:val="28"/>
+                        </w:rPr>
+                        <w:t>db_servers</w:t>
+                      </w:r>
+                      <w:proofErr w:type="spellEnd"/>
+                      <w:r>
+                        <w:rPr>
+                          <w:rFonts w:asciiTheme="majorBidi" w:hAnsiTheme="majorBidi" w:cstheme="majorBidi"/>
+                          <w:b/>
+                          <w:bCs/>
+                          <w:i/>
+                          <w:iCs/>
+                          <w:sz w:val="28"/>
+                          <w:szCs w:val="28"/>
+                        </w:rPr>
+                        <w:t>', [])) or</w:t>
+                      </w:r>
+                    </w:p>
+                    <w:p>
+                      <w:pPr>
+                        <w:spacing w:after="0"/>
+                        <w:rPr>
+                          <w:rFonts w:asciiTheme="majorBidi" w:hAnsiTheme="majorBidi" w:cstheme="majorBidi"/>
+                          <w:b/>
+                          <w:bCs/>
+                          <w:i/>
+                          <w:iCs/>
+                          <w:sz w:val="28"/>
+                          <w:szCs w:val="28"/>
+                        </w:rPr>
+                      </w:pPr>
+                      <w:r>
+                        <w:rPr>
+                          <w:rFonts w:asciiTheme="majorBidi" w:hAnsiTheme="majorBidi" w:cstheme="majorBidi"/>
+                          <w:b/>
+                          <w:bCs/>
+                          <w:i/>
+                          <w:iCs/>
+                          <w:sz w:val="28"/>
+                          <w:szCs w:val="28"/>
+                        </w:rPr>
+                        <w:t xml:space="preserve">    (</w:t>
+                      </w:r>
+                      <w:proofErr w:type="spellStart"/>
+                      <w:r>
+                        <w:rPr>
+                          <w:rFonts w:asciiTheme="majorBidi" w:hAnsiTheme="majorBidi" w:cstheme="majorBidi"/>
+                          <w:b/>
+                          <w:bCs/>
+                          <w:i/>
+                          <w:iCs/>
+                          <w:sz w:val="28"/>
+                          <w:szCs w:val="28"/>
+                        </w:rPr>
+                        <w:t>force_cleanup</w:t>
+                      </w:r>
+                      <w:proofErr w:type="spellEnd"/>
+                      <w:r>
+                        <w:rPr>
+                          <w:rFonts w:asciiTheme="majorBidi" w:hAnsiTheme="majorBidi" w:cstheme="majorBidi"/>
+                          <w:b/>
+                          <w:bCs/>
+                          <w:i/>
+                          <w:iCs/>
+                          <w:sz w:val="28"/>
+                          <w:szCs w:val="28"/>
+                        </w:rPr>
+                        <w:t xml:space="preserve"> | default(false) | bool)</w:t>
+                      </w:r>
+                    </w:p>
+                    <w:p>
+                      <w:pPr>
+                        <w:jc w:val="center"/>
+                      </w:pPr>
+                    </w:p>
+                  </w:txbxContent>
+                </v:textbox>
+                <w10:wrap anchorx="margin"/>
+              </v:rect>
+            </w:pict>
+          </mc:Fallback>
+        </mc:AlternateContent>
+      </w:r>
+      <w:r>
+        <w:rPr>
+          <w:rFonts w:asciiTheme="majorBidi" w:hAnsiTheme="majorBidi" w:cstheme="majorBidi"/>
+          <w:sz w:val="28"/>
+          <w:szCs w:val="28"/>
+        </w:rPr>
+        <w:t>You are running a playbook across your entire inventory (</w:t>
+      </w:r>
+      <w:r>
+        <w:rPr>
+          <w:rFonts w:asciiTheme="majorBidi" w:hAnsiTheme="majorBidi" w:cstheme="majorBidi"/>
+          <w:b/>
+          <w:bCs/>
+          <w:i/>
+          <w:iCs/>
+          <w:sz w:val="28"/>
+          <w:szCs w:val="28"/>
+        </w:rPr>
+        <w:t>hosts: all</w:t>
+      </w:r>
+      <w:r>
+        <w:rPr>
+          <w:rFonts w:asciiTheme="majorBidi" w:hAnsiTheme="majorBidi" w:cstheme="majorBidi"/>
+          <w:sz w:val="28"/>
+          <w:szCs w:val="28"/>
+        </w:rPr>
+        <w:t xml:space="preserve">). You need to perform a cleanup task, but it should only trigger if the host is a Database server </w:t>
+      </w:r>
+      <w:r>
+        <w:rPr>
+          <w:rFonts w:asciiTheme="majorBidi" w:hAnsiTheme="majorBidi" w:cstheme="majorBidi"/>
+          <w:b/>
+          <w:bCs/>
+          <w:sz w:val="28"/>
+          <w:szCs w:val="28"/>
+        </w:rPr>
+        <w:t>OR</w:t>
+      </w:r>
+      <w:r>
+        <w:rPr>
+          <w:rFonts w:asciiTheme="majorBidi" w:hAnsiTheme="majorBidi" w:cstheme="majorBidi"/>
+          <w:sz w:val="28"/>
+          <w:szCs w:val="28"/>
+        </w:rPr>
+        <w:t xml:space="preserve"> if you have explicitly triggered a force-cleanup via an extra variable. Furthermore, you must ensure the task doesn’t crash if the variable hasn’t been defined.</w:t>
+      </w:r>
+    </w:p>
+    <w:p>
+      <w:pPr>
+        <w:jc w:val="both"/>
+        <w:rPr>
+          <w:rFonts w:asciiTheme="majorBidi" w:hAnsiTheme="majorBidi" w:cstheme="majorBidi"/>
+          <w:sz w:val="28"/>
+          <w:szCs w:val="28"/>
+        </w:rPr>
+      </w:pPr>
+    </w:p>
+    <w:p>
+      <w:pPr>
+        <w:jc w:val="both"/>
+        <w:rPr>
+          <w:rFonts w:asciiTheme="majorBidi" w:hAnsiTheme="majorBidi" w:cstheme="majorBidi"/>
+          <w:sz w:val="28"/>
+          <w:szCs w:val="28"/>
+        </w:rPr>
+      </w:pPr>
+    </w:p>
+    <w:p>
+      <w:pPr>
+        <w:jc w:val="both"/>
+        <w:rPr>
+          <w:rFonts w:asciiTheme="majorBidi" w:hAnsiTheme="majorBidi" w:cstheme="majorBidi"/>
+          <w:sz w:val="28"/>
+          <w:szCs w:val="28"/>
+        </w:rPr>
+      </w:pPr>
+    </w:p>
+    <w:p>
+      <w:pPr>
+        <w:jc w:val="both"/>
+        <w:rPr>
+          <w:rFonts w:asciiTheme="majorBidi" w:hAnsiTheme="majorBidi" w:cstheme="majorBidi"/>
+          <w:sz w:val="28"/>
+          <w:szCs w:val="28"/>
+        </w:rPr>
+      </w:pPr>
+    </w:p>
+    <w:p>
+      <w:pPr>
+        <w:spacing w:after="60"/>
+        <w:jc w:val="both"/>
+        <w:rPr>
+          <w:rFonts w:asciiTheme="majorBidi" w:hAnsiTheme="majorBidi" w:cstheme="majorBidi"/>
+          <w:b/>
+          <w:bCs/>
+          <w:sz w:val="28"/>
+          <w:szCs w:val="28"/>
+        </w:rPr>
+      </w:pPr>
+      <w:r>
+        <w:rPr>
+          <w:rFonts w:asciiTheme="majorBidi" w:hAnsiTheme="majorBidi" w:cstheme="majorBidi"/>
+          <w:b/>
+          <w:bCs/>
+          <w:sz w:val="28"/>
+          <w:szCs w:val="28"/>
+        </w:rPr>
+        <w:t>Explanation:</w:t>
+      </w:r>
+    </w:p>
+    <w:p>
+      <w:pPr>
+        <w:pStyle w:val="ListParagraph"/>
+        <w:numPr>
+          <w:ilvl w:val="0"/>
+          <w:numId w:val="24"/>
+        </w:numPr>
+        <w:ind w:left="360"/>
+        <w:jc w:val="both"/>
+        <w:rPr>
+          <w:rFonts w:asciiTheme="majorBidi" w:hAnsiTheme="majorBidi" w:cstheme="majorBidi"/>
+          <w:sz w:val="28"/>
+          <w:szCs w:val="28"/>
+        </w:rPr>
+      </w:pPr>
+      <w:r>
+        <w:rPr>
+          <w:rFonts w:asciiTheme="majorBidi" w:hAnsiTheme="majorBidi" w:cstheme="majorBidi"/>
+          <w:b/>
+          <w:bCs/>
+          <w:sz w:val="28"/>
+          <w:szCs w:val="28"/>
+        </w:rPr>
+        <w:t>&gt; (Greater Than Sign)</w:t>
+      </w:r>
+      <w:r>
+        <w:rPr>
+          <w:rFonts w:asciiTheme="majorBidi" w:hAnsiTheme="majorBidi" w:cstheme="majorBidi"/>
+          <w:sz w:val="28"/>
+          <w:szCs w:val="28"/>
+        </w:rPr>
+        <w:t xml:space="preserve"> → This is the YAML “</w:t>
+      </w:r>
+      <w:r>
+        <w:rPr>
+          <w:rFonts w:asciiTheme="majorBidi" w:hAnsiTheme="majorBidi" w:cstheme="majorBidi"/>
+          <w:b/>
+          <w:bCs/>
+          <w:sz w:val="28"/>
+          <w:szCs w:val="28"/>
+        </w:rPr>
+        <w:t>folded block</w:t>
+      </w:r>
+      <w:r>
+        <w:rPr>
+          <w:rFonts w:asciiTheme="majorBidi" w:hAnsiTheme="majorBidi" w:cstheme="majorBidi"/>
+          <w:sz w:val="28"/>
+          <w:szCs w:val="28"/>
+        </w:rPr>
+        <w:t>” scalar. It allows you to write a complex, multi-line logic expression over several lines, making it much easier to read than a single long string.</w:t>
+      </w:r>
+    </w:p>
+    <w:p>
+      <w:pPr>
+        <w:pStyle w:val="ListParagraph"/>
+        <w:numPr>
+          <w:ilvl w:val="0"/>
+          <w:numId w:val="24"/>
+        </w:numPr>
+        <w:ind w:left="360"/>
+        <w:jc w:val="both"/>
+        <w:rPr>
+          <w:rFonts w:asciiTheme="majorBidi" w:hAnsiTheme="majorBidi" w:cstheme="majorBidi"/>
+          <w:sz w:val="28"/>
+          <w:szCs w:val="28"/>
+        </w:rPr>
+      </w:pPr>
+      <w:proofErr w:type="spellStart"/>
+      <w:proofErr w:type="gramStart"/>
+      <w:r>
+        <w:rPr>
+          <w:rFonts w:asciiTheme="majorBidi" w:hAnsiTheme="majorBidi" w:cstheme="majorBidi"/>
+          <w:b/>
+          <w:bCs/>
+          <w:i/>
+          <w:iCs/>
+          <w:sz w:val="28"/>
+          <w:szCs w:val="28"/>
+        </w:rPr>
+        <w:t>groups.get</w:t>
+      </w:r>
+      <w:proofErr w:type="spellEnd"/>
+      <w:r>
+        <w:rPr>
+          <w:rFonts w:asciiTheme="majorBidi" w:hAnsiTheme="majorBidi" w:cstheme="majorBidi"/>
+          <w:b/>
+          <w:bCs/>
+          <w:i/>
+          <w:iCs/>
+          <w:sz w:val="28"/>
+          <w:szCs w:val="28"/>
+        </w:rPr>
+        <w:t>(</w:t>
+      </w:r>
+      <w:proofErr w:type="gramEnd"/>
+      <w:r>
+        <w:rPr>
+          <w:rFonts w:asciiTheme="majorBidi" w:hAnsiTheme="majorBidi" w:cstheme="majorBidi"/>
+          <w:b/>
+          <w:bCs/>
+          <w:i/>
+          <w:iCs/>
+          <w:sz w:val="28"/>
+          <w:szCs w:val="28"/>
+        </w:rPr>
+        <w:t>'</w:t>
+      </w:r>
+      <w:proofErr w:type="spellStart"/>
+      <w:r>
+        <w:rPr>
+          <w:rFonts w:asciiTheme="majorBidi" w:hAnsiTheme="majorBidi" w:cstheme="majorBidi"/>
+          <w:b/>
+          <w:bCs/>
+          <w:i/>
+          <w:iCs/>
+          <w:sz w:val="28"/>
+          <w:szCs w:val="28"/>
+        </w:rPr>
+        <w:t>db_servers</w:t>
+      </w:r>
+      <w:proofErr w:type="spellEnd"/>
+      <w:r>
+        <w:rPr>
+          <w:rFonts w:asciiTheme="majorBidi" w:hAnsiTheme="majorBidi" w:cstheme="majorBidi"/>
+          <w:b/>
+          <w:bCs/>
+          <w:i/>
+          <w:iCs/>
+          <w:sz w:val="28"/>
+          <w:szCs w:val="28"/>
+        </w:rPr>
+        <w:t>', [])</w:t>
+      </w:r>
+      <w:r>
+        <w:rPr>
+          <w:rFonts w:asciiTheme="majorBidi" w:hAnsiTheme="majorBidi" w:cstheme="majorBidi"/>
+          <w:sz w:val="28"/>
+          <w:szCs w:val="28"/>
+        </w:rPr>
+        <w:t xml:space="preserve"> → This is defensive programming. If your inventory has no </w:t>
+      </w:r>
+      <w:r>
+        <w:rPr>
+          <w:rFonts w:asciiTheme="majorBidi" w:hAnsiTheme="majorBidi" w:cstheme="majorBidi"/>
+          <w:b/>
+          <w:bCs/>
+          <w:i/>
+          <w:iCs/>
+          <w:sz w:val="28"/>
+          <w:szCs w:val="28"/>
+        </w:rPr>
+        <w:t>[</w:t>
+      </w:r>
+      <w:proofErr w:type="spellStart"/>
+      <w:r>
+        <w:rPr>
+          <w:rFonts w:asciiTheme="majorBidi" w:hAnsiTheme="majorBidi" w:cstheme="majorBidi"/>
+          <w:b/>
+          <w:bCs/>
+          <w:i/>
+          <w:iCs/>
+          <w:sz w:val="28"/>
+          <w:szCs w:val="28"/>
+        </w:rPr>
+        <w:t>db_servers</w:t>
+      </w:r>
+      <w:proofErr w:type="spellEnd"/>
+      <w:r>
+        <w:rPr>
+          <w:rFonts w:asciiTheme="majorBidi" w:hAnsiTheme="majorBidi" w:cstheme="majorBidi"/>
+          <w:b/>
+          <w:bCs/>
+          <w:i/>
+          <w:iCs/>
+          <w:sz w:val="28"/>
+          <w:szCs w:val="28"/>
+        </w:rPr>
+        <w:t>]</w:t>
+      </w:r>
+      <w:r>
+        <w:rPr>
+          <w:rFonts w:asciiTheme="majorBidi" w:hAnsiTheme="majorBidi" w:cstheme="majorBidi"/>
+          <w:sz w:val="28"/>
+          <w:szCs w:val="28"/>
+        </w:rPr>
+        <w:t xml:space="preserve"> group, a </w:t>
+      </w:r>
+      <w:proofErr w:type="gramStart"/>
+      <w:r>
+        <w:rPr>
+          <w:rFonts w:asciiTheme="majorBidi" w:hAnsiTheme="majorBidi" w:cstheme="majorBidi"/>
+          <w:sz w:val="28"/>
+          <w:szCs w:val="28"/>
+        </w:rPr>
+        <w:t xml:space="preserve">standard </w:t>
+      </w:r>
+      <w:r>
+        <w:rPr>
+          <w:rFonts w:asciiTheme="majorBidi" w:hAnsiTheme="majorBidi" w:cstheme="majorBidi"/>
+          <w:b/>
+          <w:bCs/>
+          <w:i/>
+          <w:iCs/>
+          <w:sz w:val="28"/>
+          <w:szCs w:val="28"/>
+        </w:rPr>
+        <w:t>groups</w:t>
+      </w:r>
+      <w:proofErr w:type="gramEnd"/>
+      <w:r>
+        <w:rPr>
+          <w:rFonts w:asciiTheme="majorBidi" w:hAnsiTheme="majorBidi" w:cstheme="majorBidi"/>
+          <w:b/>
+          <w:bCs/>
+          <w:i/>
+          <w:iCs/>
+          <w:sz w:val="28"/>
+          <w:szCs w:val="28"/>
+        </w:rPr>
+        <w:t>['</w:t>
+      </w:r>
+      <w:proofErr w:type="spellStart"/>
+      <w:r>
+        <w:rPr>
+          <w:rFonts w:asciiTheme="majorBidi" w:hAnsiTheme="majorBidi" w:cstheme="majorBidi"/>
+          <w:b/>
+          <w:bCs/>
+          <w:i/>
+          <w:iCs/>
+          <w:sz w:val="28"/>
+          <w:szCs w:val="28"/>
+        </w:rPr>
+        <w:t>db_servers</w:t>
+      </w:r>
+      <w:proofErr w:type="spellEnd"/>
+      <w:r>
+        <w:rPr>
+          <w:rFonts w:asciiTheme="majorBidi" w:hAnsiTheme="majorBidi" w:cstheme="majorBidi"/>
+          <w:b/>
+          <w:bCs/>
+          <w:i/>
+          <w:iCs/>
+          <w:sz w:val="28"/>
+          <w:szCs w:val="28"/>
+        </w:rPr>
+        <w:t>']</w:t>
+      </w:r>
+      <w:r>
+        <w:rPr>
+          <w:rFonts w:asciiTheme="majorBidi" w:hAnsiTheme="majorBidi" w:cstheme="majorBidi"/>
+          <w:sz w:val="28"/>
+          <w:szCs w:val="28"/>
+        </w:rPr>
+        <w:t xml:space="preserve"> would crash your playbook with an error. </w:t>
+      </w:r>
+      <w:proofErr w:type="gramStart"/>
+      <w:r>
+        <w:rPr>
+          <w:rFonts w:asciiTheme="majorBidi" w:hAnsiTheme="majorBidi" w:cstheme="majorBidi"/>
+          <w:sz w:val="28"/>
+          <w:szCs w:val="28"/>
+        </w:rPr>
+        <w:t xml:space="preserve">Using </w:t>
+      </w:r>
+      <w:r>
+        <w:rPr>
+          <w:rFonts w:asciiTheme="majorBidi" w:hAnsiTheme="majorBidi" w:cstheme="majorBidi"/>
+          <w:b/>
+          <w:bCs/>
+          <w:i/>
+          <w:iCs/>
+          <w:sz w:val="28"/>
+          <w:szCs w:val="28"/>
+        </w:rPr>
+        <w:t>.get</w:t>
+      </w:r>
+      <w:proofErr w:type="gramEnd"/>
+      <w:r>
+        <w:rPr>
+          <w:rFonts w:asciiTheme="majorBidi" w:hAnsiTheme="majorBidi" w:cstheme="majorBidi"/>
+          <w:b/>
+          <w:bCs/>
+          <w:i/>
+          <w:iCs/>
+          <w:sz w:val="28"/>
+          <w:szCs w:val="28"/>
+        </w:rPr>
+        <w:t>(key, default)</w:t>
+      </w:r>
+      <w:r>
+        <w:rPr>
+          <w:rFonts w:asciiTheme="majorBidi" w:hAnsiTheme="majorBidi" w:cstheme="majorBidi"/>
+          <w:sz w:val="28"/>
+          <w:szCs w:val="28"/>
+        </w:rPr>
+        <w:t xml:space="preserve"> ensures it returns an empty list [] instead, keeping your play stable.</w:t>
+      </w:r>
+    </w:p>
+    <w:p>
+      <w:pPr>
+        <w:pStyle w:val="ListParagraph"/>
+        <w:numPr>
+          <w:ilvl w:val="0"/>
+          <w:numId w:val="24"/>
+        </w:numPr>
+        <w:ind w:left="360"/>
+        <w:jc w:val="both"/>
+        <w:rPr>
+          <w:rFonts w:asciiTheme="majorBidi" w:hAnsiTheme="majorBidi" w:cstheme="majorBidi"/>
+          <w:sz w:val="28"/>
+          <w:szCs w:val="28"/>
+        </w:rPr>
+      </w:pPr>
+      <w:proofErr w:type="spellStart"/>
+      <w:r>
+        <w:rPr>
+          <w:rFonts w:asciiTheme="majorBidi" w:hAnsiTheme="majorBidi" w:cstheme="majorBidi"/>
+          <w:b/>
+          <w:bCs/>
+          <w:i/>
+          <w:iCs/>
+          <w:sz w:val="28"/>
+          <w:szCs w:val="28"/>
+        </w:rPr>
+        <w:t>force_cleanup</w:t>
+      </w:r>
+      <w:proofErr w:type="spellEnd"/>
+      <w:r>
+        <w:rPr>
+          <w:rFonts w:asciiTheme="majorBidi" w:hAnsiTheme="majorBidi" w:cstheme="majorBidi"/>
+          <w:b/>
+          <w:bCs/>
+          <w:i/>
+          <w:iCs/>
+          <w:sz w:val="28"/>
+          <w:szCs w:val="28"/>
+        </w:rPr>
+        <w:t xml:space="preserve"> | default(false)</w:t>
+      </w:r>
+      <w:r>
+        <w:rPr>
+          <w:rFonts w:asciiTheme="majorBidi" w:hAnsiTheme="majorBidi" w:cstheme="majorBidi"/>
+          <w:sz w:val="28"/>
+          <w:szCs w:val="28"/>
+        </w:rPr>
+        <w:t xml:space="preserve"> → This is the standard safety pattern in Ansible. It says: “Use the value of </w:t>
+      </w:r>
+      <w:proofErr w:type="spellStart"/>
+      <w:r>
+        <w:rPr>
+          <w:rFonts w:asciiTheme="majorBidi" w:hAnsiTheme="majorBidi" w:cstheme="majorBidi"/>
+          <w:b/>
+          <w:bCs/>
+          <w:i/>
+          <w:iCs/>
+          <w:sz w:val="28"/>
+          <w:szCs w:val="28"/>
+        </w:rPr>
+        <w:t>force_cleanup</w:t>
+      </w:r>
+      <w:proofErr w:type="spellEnd"/>
+      <w:r>
+        <w:rPr>
+          <w:rFonts w:asciiTheme="majorBidi" w:hAnsiTheme="majorBidi" w:cstheme="majorBidi"/>
+          <w:sz w:val="28"/>
+          <w:szCs w:val="28"/>
+        </w:rPr>
+        <w:t xml:space="preserve"> if it exists; otherwise, assume it is false.” This prevents “undefined variable” errors.</w:t>
+      </w:r>
+    </w:p>
+    <w:p>
+      <w:pPr>
+        <w:pStyle w:val="ListParagraph"/>
+        <w:numPr>
+          <w:ilvl w:val="0"/>
+          <w:numId w:val="24"/>
+        </w:numPr>
+        <w:ind w:left="360"/>
+        <w:jc w:val="both"/>
+        <w:rPr>
+          <w:rFonts w:asciiTheme="majorBidi" w:hAnsiTheme="majorBidi" w:cstheme="majorBidi"/>
+          <w:sz w:val="28"/>
+          <w:szCs w:val="28"/>
+        </w:rPr>
+      </w:pPr>
+      <w:r>
+        <w:rPr>
+          <w:rFonts w:asciiTheme="majorBidi" w:hAnsiTheme="majorBidi" w:cstheme="majorBidi"/>
+          <w:b/>
+          <w:bCs/>
+          <w:i/>
+          <w:iCs/>
+          <w:sz w:val="28"/>
+          <w:szCs w:val="28"/>
+        </w:rPr>
+        <w:t>| bool</w:t>
+      </w:r>
+      <w:r>
+        <w:rPr>
+          <w:rFonts w:asciiTheme="majorBidi" w:hAnsiTheme="majorBidi" w:cstheme="majorBidi"/>
+          <w:sz w:val="28"/>
+          <w:szCs w:val="28"/>
+        </w:rPr>
+        <w:t xml:space="preserve"> → This is a Jinja2 filter. Sometimes when you pass variables from the CLI (</w:t>
+      </w:r>
+      <w:r>
+        <w:rPr>
+          <w:rFonts w:asciiTheme="majorBidi" w:hAnsiTheme="majorBidi" w:cstheme="majorBidi"/>
+          <w:b/>
+          <w:bCs/>
+          <w:i/>
+          <w:iCs/>
+          <w:sz w:val="28"/>
+          <w:szCs w:val="28"/>
+        </w:rPr>
+        <w:t>-e</w:t>
+      </w:r>
+      <w:r>
+        <w:rPr>
+          <w:rFonts w:asciiTheme="majorBidi" w:hAnsiTheme="majorBidi" w:cstheme="majorBidi"/>
+          <w:sz w:val="28"/>
+          <w:szCs w:val="28"/>
+        </w:rPr>
+        <w:t xml:space="preserve">), they arrive as strings (e.g., "true"). The </w:t>
+      </w:r>
+      <w:r>
+        <w:rPr>
+          <w:rFonts w:asciiTheme="majorBidi" w:hAnsiTheme="majorBidi" w:cstheme="majorBidi"/>
+          <w:b/>
+          <w:bCs/>
+          <w:i/>
+          <w:iCs/>
+          <w:sz w:val="28"/>
+          <w:szCs w:val="28"/>
+        </w:rPr>
+        <w:t>| bool</w:t>
+      </w:r>
+      <w:r>
+        <w:rPr>
+          <w:rFonts w:asciiTheme="majorBidi" w:hAnsiTheme="majorBidi" w:cstheme="majorBidi"/>
+          <w:sz w:val="28"/>
+          <w:szCs w:val="28"/>
+        </w:rPr>
+        <w:t xml:space="preserve"> filter ensures that the value is cast to an actual </w:t>
+      </w:r>
+      <w:proofErr w:type="spellStart"/>
+      <w:r>
+        <w:rPr>
+          <w:rFonts w:asciiTheme="majorBidi" w:hAnsiTheme="majorBidi" w:cstheme="majorBidi"/>
+          <w:b/>
+          <w:bCs/>
+          <w:i/>
+          <w:iCs/>
+          <w:sz w:val="28"/>
+          <w:szCs w:val="28"/>
+        </w:rPr>
+        <w:t>boolean</w:t>
+      </w:r>
+      <w:proofErr w:type="spellEnd"/>
+      <w:r>
+        <w:rPr>
+          <w:rFonts w:asciiTheme="majorBidi" w:hAnsiTheme="majorBidi" w:cstheme="majorBidi"/>
+          <w:sz w:val="28"/>
+          <w:szCs w:val="28"/>
+        </w:rPr>
+        <w:t xml:space="preserve"> True so the logic evaluates correctly.</w:t>
+      </w:r>
+    </w:p>
+    <w:p>
+      <w:pPr>
+        <w:pStyle w:val="ListParagraph"/>
+        <w:numPr>
+          <w:ilvl w:val="0"/>
+          <w:numId w:val="24"/>
+        </w:numPr>
+        <w:ind w:left="360"/>
+        <w:jc w:val="both"/>
+        <w:rPr>
+          <w:rFonts w:asciiTheme="majorBidi" w:hAnsiTheme="majorBidi" w:cstheme="majorBidi"/>
+          <w:sz w:val="28"/>
+          <w:szCs w:val="28"/>
+        </w:rPr>
+      </w:pPr>
+      <w:r>
+        <w:rPr>
+          <w:rFonts w:asciiTheme="majorBidi" w:hAnsiTheme="majorBidi" w:cstheme="majorBidi"/>
+          <w:b/>
+          <w:bCs/>
+          <w:i/>
+          <w:iCs/>
+          <w:sz w:val="28"/>
+          <w:szCs w:val="28"/>
+        </w:rPr>
+        <w:t>or</w:t>
+      </w:r>
+      <w:r>
+        <w:rPr>
+          <w:rFonts w:asciiTheme="majorBidi" w:hAnsiTheme="majorBidi" w:cstheme="majorBidi"/>
+          <w:sz w:val="28"/>
+          <w:szCs w:val="28"/>
+        </w:rPr>
+        <w:t xml:space="preserve"> </w:t>
+      </w:r>
+      <w:r>
+        <w:rPr>
+          <w:rFonts w:asciiTheme="majorBidi" w:hAnsiTheme="majorBidi" w:cstheme="majorBidi"/>
+          <w:b/>
+          <w:bCs/>
+          <w:sz w:val="28"/>
+          <w:szCs w:val="28"/>
+        </w:rPr>
+        <w:t>logic</w:t>
+      </w:r>
+      <w:r>
+        <w:rPr>
+          <w:rFonts w:asciiTheme="majorBidi" w:hAnsiTheme="majorBidi" w:cstheme="majorBidi"/>
+          <w:sz w:val="28"/>
+          <w:szCs w:val="28"/>
+        </w:rPr>
+        <w:t xml:space="preserve"> → This demonstrates how you can combine a “system-aware” condition (is it a DB server?) with a “manual-override” condition (did the user ask for a force-run?).</w:t>
+      </w:r>
+    </w:p>
+    <w:p>
+      <w:pPr>
+        <w:pStyle w:val="ListParagraph"/>
+        <w:ind w:left="360"/>
+        <w:jc w:val="both"/>
+        <w:rPr>
+          <w:rFonts w:asciiTheme="majorBidi" w:hAnsiTheme="majorBidi" w:cstheme="majorBidi"/>
+          <w:sz w:val="8"/>
+          <w:szCs w:val="8"/>
+        </w:rPr>
+      </w:pPr>
+    </w:p>
+    <w:p>
+      <w:pPr>
+        <w:pStyle w:val="ListParagraph"/>
+        <w:numPr>
+          <w:ilvl w:val="0"/>
+          <w:numId w:val="25"/>
+        </w:numPr>
+        <w:spacing w:after="80"/>
+        <w:ind w:left="360"/>
+        <w:jc w:val="both"/>
+        <w:rPr>
+          <w:rFonts w:asciiTheme="majorBidi" w:hAnsiTheme="majorBidi" w:cstheme="majorBidi"/>
+          <w:sz w:val="28"/>
+          <w:szCs w:val="28"/>
+        </w:rPr>
+      </w:pPr>
+      <w:r>
+        <w:rPr>
+          <w:rFonts w:asciiTheme="majorBidi" w:hAnsiTheme="majorBidi" w:cstheme="majorBidi"/>
+          <w:b/>
+          <w:bCs/>
+          <w:i/>
+          <w:iCs/>
+          <w:sz w:val="28"/>
+          <w:szCs w:val="28"/>
+        </w:rPr>
+        <w:t>(</w:t>
+      </w:r>
+      <w:proofErr w:type="spellStart"/>
+      <w:r>
+        <w:rPr>
+          <w:rFonts w:asciiTheme="majorBidi" w:hAnsiTheme="majorBidi" w:cstheme="majorBidi"/>
+          <w:b/>
+          <w:bCs/>
+          <w:i/>
+          <w:iCs/>
+          <w:sz w:val="28"/>
+          <w:szCs w:val="28"/>
+        </w:rPr>
+        <w:t>force_cleanup</w:t>
+      </w:r>
+      <w:proofErr w:type="spellEnd"/>
+      <w:r>
+        <w:rPr>
+          <w:rFonts w:asciiTheme="majorBidi" w:hAnsiTheme="majorBidi" w:cstheme="majorBidi"/>
+          <w:b/>
+          <w:bCs/>
+          <w:i/>
+          <w:iCs/>
+          <w:sz w:val="28"/>
+          <w:szCs w:val="28"/>
+        </w:rPr>
+        <w:t xml:space="preserve"> | default(false) | bool)</w:t>
+      </w:r>
+    </w:p>
+    <w:p>
+      <w:pPr>
+        <w:spacing w:after="60"/>
+        <w:ind w:left="360"/>
+        <w:jc w:val="both"/>
+        <w:rPr>
+          <w:rFonts w:asciiTheme="majorBidi" w:hAnsiTheme="majorBidi" w:cstheme="majorBidi"/>
+          <w:b/>
+          <w:bCs/>
+          <w:sz w:val="28"/>
+          <w:szCs w:val="28"/>
+        </w:rPr>
+      </w:pPr>
+      <w:r>
+        <w:rPr>
+          <w:rFonts w:asciiTheme="majorBidi" w:hAnsiTheme="majorBidi" w:cstheme="majorBidi"/>
+          <w:b/>
+          <w:bCs/>
+          <w:sz w:val="28"/>
+          <w:szCs w:val="28"/>
+        </w:rPr>
+        <w:t>What the Pipe | does</w:t>
+      </w:r>
+      <w:r>
+        <w:rPr>
+          <w:rFonts w:asciiTheme="majorBidi" w:hAnsiTheme="majorBidi" w:cstheme="majorBidi"/>
+          <w:b/>
+          <w:bCs/>
+          <w:sz w:val="28"/>
+          <w:szCs w:val="28"/>
+        </w:rPr>
+        <w:t>?</w:t>
+      </w:r>
+    </w:p>
+    <w:p>
+      <w:pPr>
+        <w:spacing w:after="80"/>
+        <w:ind w:left="360"/>
+        <w:jc w:val="both"/>
+        <w:rPr>
+          <w:rFonts w:asciiTheme="majorBidi" w:hAnsiTheme="majorBidi" w:cstheme="majorBidi"/>
+          <w:sz w:val="28"/>
+          <w:szCs w:val="28"/>
+        </w:rPr>
+      </w:pPr>
+      <w:r>
+        <w:rPr>
+          <w:rFonts w:asciiTheme="majorBidi" w:hAnsiTheme="majorBidi" w:cstheme="majorBidi"/>
+          <w:sz w:val="28"/>
+          <w:szCs w:val="28"/>
+        </w:rPr>
+        <w:t xml:space="preserve">Think of the </w:t>
+      </w:r>
+      <w:r>
+        <w:rPr>
+          <w:rFonts w:asciiTheme="majorBidi" w:hAnsiTheme="majorBidi" w:cstheme="majorBidi"/>
+          <w:b/>
+          <w:bCs/>
+          <w:sz w:val="28"/>
+          <w:szCs w:val="28"/>
+        </w:rPr>
+        <w:t>pipe |</w:t>
+      </w:r>
+      <w:r>
+        <w:rPr>
+          <w:rFonts w:asciiTheme="majorBidi" w:hAnsiTheme="majorBidi" w:cstheme="majorBidi"/>
+          <w:sz w:val="28"/>
+          <w:szCs w:val="28"/>
+        </w:rPr>
+        <w:t xml:space="preserve"> like an assembly line:</w:t>
+      </w:r>
+      <w:r>
+        <w:rPr>
+          <w:rFonts w:asciiTheme="majorBidi" w:hAnsiTheme="majorBidi" w:cstheme="majorBidi"/>
+          <w:sz w:val="28"/>
+          <w:szCs w:val="28"/>
+        </w:rPr>
+        <w:t xml:space="preserve"> </w:t>
+      </w:r>
+      <w:r>
+        <w:rPr>
+          <w:rFonts w:asciiTheme="majorBidi" w:hAnsiTheme="majorBidi" w:cstheme="majorBidi"/>
+          <w:b/>
+          <w:bCs/>
+          <w:i/>
+          <w:iCs/>
+          <w:sz w:val="28"/>
+          <w:szCs w:val="28"/>
+        </w:rPr>
+        <w:t>DATA | TOOL</w:t>
+      </w:r>
+      <w:r>
+        <w:rPr>
+          <w:rFonts w:asciiTheme="majorBidi" w:hAnsiTheme="majorBidi" w:cstheme="majorBidi"/>
+          <w:b/>
+          <w:bCs/>
+          <w:i/>
+          <w:iCs/>
+          <w:sz w:val="28"/>
+          <w:szCs w:val="28"/>
+        </w:rPr>
+        <w:t xml:space="preserve"> </w:t>
+      </w:r>
+      <w:r>
+        <w:rPr>
+          <w:rFonts w:asciiTheme="majorBidi" w:hAnsiTheme="majorBidi" w:cstheme="majorBidi"/>
+          <w:sz w:val="28"/>
+          <w:szCs w:val="28"/>
+        </w:rPr>
+        <w:t>→</w:t>
+      </w:r>
+      <w:r>
+        <w:rPr>
+          <w:rFonts w:asciiTheme="majorBidi" w:hAnsiTheme="majorBidi" w:cstheme="majorBidi"/>
+          <w:sz w:val="28"/>
+          <w:szCs w:val="28"/>
+        </w:rPr>
+        <w:t xml:space="preserve"> </w:t>
+      </w:r>
+      <w:r>
+        <w:rPr>
+          <w:rFonts w:asciiTheme="majorBidi" w:hAnsiTheme="majorBidi" w:cstheme="majorBidi"/>
+          <w:sz w:val="28"/>
+          <w:szCs w:val="28"/>
+        </w:rPr>
+        <w:t>The data on the left is sent into the tool on the right, and the tool returns a transformed result.</w:t>
+      </w:r>
+    </w:p>
+    <w:p>
+      <w:pPr>
+        <w:spacing w:after="60"/>
+        <w:ind w:left="360"/>
+        <w:jc w:val="both"/>
+        <w:rPr>
+          <w:rFonts w:asciiTheme="majorBidi" w:hAnsiTheme="majorBidi" w:cstheme="majorBidi"/>
+          <w:b/>
+          <w:bCs/>
+          <w:i/>
+          <w:iCs/>
+          <w:sz w:val="28"/>
+          <w:szCs w:val="28"/>
+        </w:rPr>
+      </w:pPr>
+      <w:r>
+        <w:rPr>
+          <w:rFonts w:asciiTheme="majorBidi" w:hAnsiTheme="majorBidi" w:cstheme="majorBidi"/>
+          <w:b/>
+          <w:bCs/>
+          <w:sz w:val="28"/>
+          <w:szCs w:val="28"/>
+        </w:rPr>
+        <w:lastRenderedPageBreak/>
+        <w:t xml:space="preserve">Deconstructing </w:t>
+      </w:r>
+      <w:proofErr w:type="spellStart"/>
+      <w:r>
+        <w:rPr>
+          <w:rFonts w:asciiTheme="majorBidi" w:hAnsiTheme="majorBidi" w:cstheme="majorBidi"/>
+          <w:b/>
+          <w:bCs/>
+          <w:i/>
+          <w:iCs/>
+          <w:sz w:val="28"/>
+          <w:szCs w:val="28"/>
+        </w:rPr>
+        <w:t>force_cleanup</w:t>
+      </w:r>
+      <w:proofErr w:type="spellEnd"/>
+      <w:r>
+        <w:rPr>
+          <w:rFonts w:asciiTheme="majorBidi" w:hAnsiTheme="majorBidi" w:cstheme="majorBidi"/>
+          <w:b/>
+          <w:bCs/>
+          <w:i/>
+          <w:iCs/>
+          <w:sz w:val="28"/>
+          <w:szCs w:val="28"/>
+        </w:rPr>
+        <w:t xml:space="preserve"> | default(false) | bool</w:t>
+      </w:r>
+    </w:p>
+    <w:p>
+      <w:pPr>
+        <w:spacing w:after="60"/>
+        <w:ind w:left="360"/>
+        <w:jc w:val="both"/>
+        <w:rPr>
+          <w:rFonts w:asciiTheme="majorBidi" w:hAnsiTheme="majorBidi" w:cstheme="majorBidi"/>
+          <w:sz w:val="28"/>
+          <w:szCs w:val="28"/>
+        </w:rPr>
+      </w:pPr>
+      <w:r>
+        <w:rPr>
+          <w:rFonts w:asciiTheme="majorBidi" w:hAnsiTheme="majorBidi" w:cstheme="majorBidi"/>
+          <w:sz w:val="28"/>
+          <w:szCs w:val="28"/>
+        </w:rPr>
+        <w:t>In the expression (</w:t>
+      </w:r>
+      <w:proofErr w:type="spellStart"/>
+      <w:r>
+        <w:rPr>
+          <w:rFonts w:asciiTheme="majorBidi" w:hAnsiTheme="majorBidi" w:cstheme="majorBidi"/>
+          <w:b/>
+          <w:bCs/>
+          <w:i/>
+          <w:iCs/>
+          <w:sz w:val="28"/>
+          <w:szCs w:val="28"/>
+        </w:rPr>
+        <w:t>force_cleanup</w:t>
+      </w:r>
+      <w:proofErr w:type="spellEnd"/>
+      <w:r>
+        <w:rPr>
+          <w:rFonts w:asciiTheme="majorBidi" w:hAnsiTheme="majorBidi" w:cstheme="majorBidi"/>
+          <w:b/>
+          <w:bCs/>
+          <w:i/>
+          <w:iCs/>
+          <w:sz w:val="28"/>
+          <w:szCs w:val="28"/>
+        </w:rPr>
+        <w:t xml:space="preserve"> | default(false) | bool</w:t>
+      </w:r>
+      <w:r>
+        <w:rPr>
+          <w:rFonts w:asciiTheme="majorBidi" w:hAnsiTheme="majorBidi" w:cstheme="majorBidi"/>
+          <w:sz w:val="28"/>
+          <w:szCs w:val="28"/>
+        </w:rPr>
+        <w:t>), we are doing a chain of transformations:</w:t>
+      </w:r>
+    </w:p>
+    <w:p>
+      <w:pPr>
+        <w:pStyle w:val="ListParagraph"/>
+        <w:numPr>
+          <w:ilvl w:val="0"/>
+          <w:numId w:val="26"/>
+        </w:numPr>
+        <w:spacing w:after="60"/>
+        <w:jc w:val="both"/>
+        <w:rPr>
+          <w:rFonts w:asciiTheme="majorBidi" w:hAnsiTheme="majorBidi" w:cstheme="majorBidi"/>
+          <w:b/>
+          <w:bCs/>
+          <w:sz w:val="28"/>
+          <w:szCs w:val="28"/>
+        </w:rPr>
+      </w:pPr>
+      <w:r>
+        <w:rPr>
+          <w:rFonts w:asciiTheme="majorBidi" w:hAnsiTheme="majorBidi" w:cstheme="majorBidi"/>
+          <w:b/>
+          <w:bCs/>
+          <w:sz w:val="28"/>
+          <w:szCs w:val="28"/>
+        </w:rPr>
+        <w:t xml:space="preserve">Step 1: </w:t>
+      </w:r>
+      <w:proofErr w:type="spellStart"/>
+      <w:r>
+        <w:rPr>
+          <w:rFonts w:asciiTheme="majorBidi" w:hAnsiTheme="majorBidi" w:cstheme="majorBidi"/>
+          <w:b/>
+          <w:bCs/>
+          <w:sz w:val="28"/>
+          <w:szCs w:val="28"/>
+        </w:rPr>
+        <w:t>force_cleanup</w:t>
+      </w:r>
+      <w:proofErr w:type="spellEnd"/>
+      <w:r>
+        <w:rPr>
+          <w:rFonts w:asciiTheme="majorBidi" w:hAnsiTheme="majorBidi" w:cstheme="majorBidi"/>
+          <w:b/>
+          <w:bCs/>
+          <w:sz w:val="28"/>
+          <w:szCs w:val="28"/>
+        </w:rPr>
+        <w:t xml:space="preserve"> | default(false)</w:t>
+      </w:r>
+    </w:p>
+    <w:p>
+      <w:pPr>
+        <w:spacing w:after="60"/>
+        <w:ind w:left="720"/>
+        <w:jc w:val="both"/>
+        <w:rPr>
+          <w:rFonts w:asciiTheme="majorBidi" w:hAnsiTheme="majorBidi" w:cstheme="majorBidi"/>
+          <w:sz w:val="28"/>
+          <w:szCs w:val="28"/>
+        </w:rPr>
+      </w:pPr>
+      <w:r>
+        <w:rPr>
+          <w:rFonts w:asciiTheme="majorBidi" w:hAnsiTheme="majorBidi" w:cstheme="majorBidi"/>
+          <w:sz w:val="28"/>
+          <w:szCs w:val="28"/>
+        </w:rPr>
+        <w:t xml:space="preserve">The “data” is the variable </w:t>
+      </w:r>
+      <w:proofErr w:type="spellStart"/>
+      <w:r>
+        <w:rPr>
+          <w:rFonts w:asciiTheme="majorBidi" w:hAnsiTheme="majorBidi" w:cstheme="majorBidi"/>
+          <w:sz w:val="28"/>
+          <w:szCs w:val="28"/>
+        </w:rPr>
+        <w:t>force_cleanup</w:t>
+      </w:r>
+      <w:proofErr w:type="spellEnd"/>
+      <w:r>
+        <w:rPr>
+          <w:rFonts w:asciiTheme="majorBidi" w:hAnsiTheme="majorBidi" w:cstheme="majorBidi"/>
+          <w:sz w:val="28"/>
+          <w:szCs w:val="28"/>
+        </w:rPr>
+        <w:t>.</w:t>
+      </w:r>
+      <w:r>
+        <w:rPr>
+          <w:rFonts w:asciiTheme="majorBidi" w:hAnsiTheme="majorBidi" w:cstheme="majorBidi"/>
+          <w:sz w:val="28"/>
+          <w:szCs w:val="28"/>
+        </w:rPr>
+        <w:t xml:space="preserve"> </w:t>
+      </w:r>
+      <w:r>
+        <w:rPr>
+          <w:rFonts w:asciiTheme="majorBidi" w:hAnsiTheme="majorBidi" w:cstheme="majorBidi"/>
+          <w:sz w:val="28"/>
+          <w:szCs w:val="28"/>
+        </w:rPr>
+        <w:t>The “tool” is default(false).</w:t>
+      </w:r>
+    </w:p>
+    <w:p>
+      <w:pPr>
+        <w:pStyle w:val="ListParagraph"/>
+        <w:numPr>
+          <w:ilvl w:val="0"/>
+          <w:numId w:val="27"/>
+        </w:numPr>
+        <w:ind w:left="1080"/>
+        <w:jc w:val="both"/>
+        <w:rPr>
+          <w:rFonts w:asciiTheme="majorBidi" w:hAnsiTheme="majorBidi" w:cstheme="majorBidi"/>
+          <w:sz w:val="28"/>
+          <w:szCs w:val="28"/>
+        </w:rPr>
+      </w:pPr>
+      <w:r>
+        <w:rPr>
+          <w:rFonts w:asciiTheme="majorBidi" w:hAnsiTheme="majorBidi" w:cstheme="majorBidi"/>
+          <w:b/>
+          <w:bCs/>
+          <w:sz w:val="28"/>
+          <w:szCs w:val="28"/>
+        </w:rPr>
+        <w:t>Logic</w:t>
+      </w:r>
+      <w:r>
+        <w:rPr>
+          <w:rFonts w:asciiTheme="majorBidi" w:hAnsiTheme="majorBidi" w:cstheme="majorBidi"/>
+          <w:sz w:val="28"/>
+          <w:szCs w:val="28"/>
+        </w:rPr>
+        <w:t xml:space="preserve"> → “Try to get the value of </w:t>
+      </w:r>
+      <w:proofErr w:type="spellStart"/>
+      <w:r>
+        <w:rPr>
+          <w:rFonts w:asciiTheme="majorBidi" w:hAnsiTheme="majorBidi" w:cstheme="majorBidi"/>
+          <w:b/>
+          <w:bCs/>
+          <w:i/>
+          <w:iCs/>
+          <w:sz w:val="28"/>
+          <w:szCs w:val="28"/>
+        </w:rPr>
+        <w:t>force_cleanup</w:t>
+      </w:r>
+      <w:proofErr w:type="spellEnd"/>
+      <w:r>
+        <w:rPr>
+          <w:rFonts w:asciiTheme="majorBidi" w:hAnsiTheme="majorBidi" w:cstheme="majorBidi"/>
+          <w:sz w:val="28"/>
+          <w:szCs w:val="28"/>
+        </w:rPr>
+        <w:t>. If it doesn’t exist, use false instead.”</w:t>
+      </w:r>
+    </w:p>
+    <w:p>
+      <w:pPr>
+        <w:pStyle w:val="ListParagraph"/>
+        <w:numPr>
+          <w:ilvl w:val="0"/>
+          <w:numId w:val="27"/>
+        </w:numPr>
+        <w:ind w:left="1080"/>
+        <w:jc w:val="both"/>
+        <w:rPr>
+          <w:rFonts w:asciiTheme="majorBidi" w:hAnsiTheme="majorBidi" w:cstheme="majorBidi"/>
+          <w:sz w:val="28"/>
+          <w:szCs w:val="28"/>
+        </w:rPr>
+      </w:pPr>
+      <w:r>
+        <w:rPr>
+          <w:rFonts w:asciiTheme="majorBidi" w:hAnsiTheme="majorBidi" w:cstheme="majorBidi"/>
+          <w:b/>
+          <w:bCs/>
+          <w:sz w:val="28"/>
+          <w:szCs w:val="28"/>
+        </w:rPr>
+        <w:t>Result</w:t>
+      </w:r>
+      <w:r>
+        <w:rPr>
+          <w:rFonts w:asciiTheme="majorBidi" w:hAnsiTheme="majorBidi" w:cstheme="majorBidi"/>
+          <w:sz w:val="28"/>
+          <w:szCs w:val="28"/>
+        </w:rPr>
+        <w:t xml:space="preserve"> → We now have a guaranteed value (either the user’s value or false).</w:t>
+      </w:r>
+    </w:p>
+    <w:p>
+      <w:pPr>
+        <w:pStyle w:val="ListParagraph"/>
+        <w:jc w:val="both"/>
+        <w:rPr>
+          <w:rFonts w:asciiTheme="majorBidi" w:hAnsiTheme="majorBidi" w:cstheme="majorBidi"/>
+          <w:sz w:val="6"/>
+          <w:szCs w:val="6"/>
+        </w:rPr>
+      </w:pPr>
+    </w:p>
+    <w:p>
+      <w:pPr>
+        <w:pStyle w:val="ListParagraph"/>
+        <w:numPr>
+          <w:ilvl w:val="0"/>
+          <w:numId w:val="26"/>
+        </w:numPr>
+        <w:spacing w:after="80"/>
+        <w:jc w:val="both"/>
+        <w:rPr>
+          <w:rFonts w:asciiTheme="majorBidi" w:hAnsiTheme="majorBidi" w:cstheme="majorBidi"/>
+          <w:b/>
+          <w:bCs/>
+          <w:sz w:val="28"/>
+          <w:szCs w:val="28"/>
+        </w:rPr>
+      </w:pPr>
+      <w:r>
+        <w:rPr>
+          <w:rFonts w:asciiTheme="majorBidi" w:hAnsiTheme="majorBidi" w:cstheme="majorBidi"/>
+          <w:b/>
+          <w:bCs/>
+          <w:sz w:val="28"/>
+          <w:szCs w:val="28"/>
+        </w:rPr>
+        <w:t xml:space="preserve">Step 2: </w:t>
+      </w:r>
+      <w:r>
+        <w:rPr>
+          <w:rFonts w:asciiTheme="majorBidi" w:hAnsiTheme="majorBidi" w:cstheme="majorBidi"/>
+          <w:b/>
+          <w:bCs/>
+          <w:i/>
+          <w:iCs/>
+          <w:sz w:val="28"/>
+          <w:szCs w:val="28"/>
+        </w:rPr>
+        <w:t>[Result of Step 1] | bool</w:t>
+      </w:r>
+    </w:p>
+    <w:p>
+      <w:pPr>
+        <w:spacing w:after="60"/>
+        <w:ind w:left="720"/>
+        <w:jc w:val="both"/>
+        <w:rPr>
+          <w:rFonts w:asciiTheme="majorBidi" w:hAnsiTheme="majorBidi" w:cstheme="majorBidi"/>
+          <w:sz w:val="28"/>
+          <w:szCs w:val="28"/>
+        </w:rPr>
+      </w:pPr>
+      <w:r>
+        <w:rPr>
+          <w:rFonts w:asciiTheme="majorBidi" w:hAnsiTheme="majorBidi" w:cstheme="majorBidi"/>
+          <w:sz w:val="28"/>
+          <w:szCs w:val="28"/>
+        </w:rPr>
+        <w:t>The “data” is now the result from Step 1.</w:t>
+      </w:r>
+      <w:r>
+        <w:rPr>
+          <w:rFonts w:asciiTheme="majorBidi" w:hAnsiTheme="majorBidi" w:cstheme="majorBidi"/>
+          <w:sz w:val="28"/>
+          <w:szCs w:val="28"/>
+        </w:rPr>
+        <w:t xml:space="preserve"> </w:t>
+      </w:r>
+      <w:r>
+        <w:rPr>
+          <w:rFonts w:asciiTheme="majorBidi" w:hAnsiTheme="majorBidi" w:cstheme="majorBidi"/>
+          <w:sz w:val="28"/>
+          <w:szCs w:val="28"/>
+        </w:rPr>
+        <w:t>The “tool” is bool.</w:t>
+      </w:r>
+    </w:p>
+    <w:p>
+      <w:pPr>
+        <w:pStyle w:val="ListParagraph"/>
+        <w:numPr>
+          <w:ilvl w:val="0"/>
+          <w:numId w:val="28"/>
+        </w:numPr>
+        <w:jc w:val="both"/>
+        <w:rPr>
+          <w:rFonts w:asciiTheme="majorBidi" w:hAnsiTheme="majorBidi" w:cstheme="majorBidi"/>
+          <w:sz w:val="28"/>
+          <w:szCs w:val="28"/>
+        </w:rPr>
+      </w:pPr>
+      <w:r>
+        <w:rPr>
+          <w:rFonts w:asciiTheme="majorBidi" w:hAnsiTheme="majorBidi" w:cstheme="majorBidi"/>
+          <w:b/>
+          <w:bCs/>
+          <w:sz w:val="28"/>
+          <w:szCs w:val="28"/>
+        </w:rPr>
+        <w:t>Logic</w:t>
+      </w:r>
+      <w:r>
+        <w:rPr>
+          <w:rFonts w:asciiTheme="majorBidi" w:hAnsiTheme="majorBidi" w:cstheme="majorBidi"/>
+          <w:sz w:val="28"/>
+          <w:szCs w:val="28"/>
+        </w:rPr>
+        <w:t xml:space="preserve"> </w:t>
+      </w:r>
+      <w:r>
+        <w:rPr>
+          <w:rFonts w:asciiTheme="majorBidi" w:hAnsiTheme="majorBidi" w:cstheme="majorBidi"/>
+          <w:sz w:val="28"/>
+          <w:szCs w:val="28"/>
+        </w:rPr>
+        <w:t xml:space="preserve">→ </w:t>
+      </w:r>
+      <w:r>
+        <w:rPr>
+          <w:rFonts w:asciiTheme="majorBidi" w:hAnsiTheme="majorBidi" w:cstheme="majorBidi"/>
+          <w:sz w:val="28"/>
+          <w:szCs w:val="28"/>
+        </w:rPr>
+        <w:t xml:space="preserve">“Take that result and force it to be a </w:t>
+      </w:r>
+      <w:proofErr w:type="spellStart"/>
+      <w:r>
+        <w:rPr>
+          <w:rFonts w:asciiTheme="majorBidi" w:hAnsiTheme="majorBidi" w:cstheme="majorBidi"/>
+          <w:sz w:val="28"/>
+          <w:szCs w:val="28"/>
+        </w:rPr>
+        <w:t>boolean</w:t>
+      </w:r>
+      <w:proofErr w:type="spellEnd"/>
+      <w:r>
+        <w:rPr>
+          <w:rFonts w:asciiTheme="majorBidi" w:hAnsiTheme="majorBidi" w:cstheme="majorBidi"/>
+          <w:sz w:val="28"/>
+          <w:szCs w:val="28"/>
+        </w:rPr>
+        <w:t xml:space="preserve"> type.”</w:t>
+      </w:r>
+    </w:p>
+    <w:p>
+      <w:pPr>
+        <w:pStyle w:val="ListParagraph"/>
+        <w:numPr>
+          <w:ilvl w:val="0"/>
+          <w:numId w:val="28"/>
+        </w:numPr>
+        <w:jc w:val="both"/>
+        <w:rPr>
+          <w:rFonts w:asciiTheme="majorBidi" w:hAnsiTheme="majorBidi" w:cstheme="majorBidi"/>
+          <w:sz w:val="28"/>
+          <w:szCs w:val="28"/>
+        </w:rPr>
+      </w:pPr>
+      <w:r>
+        <w:rPr>
+          <w:rFonts w:asciiTheme="majorBidi" w:hAnsiTheme="majorBidi" w:cstheme="majorBidi"/>
+          <w:b/>
+          <w:bCs/>
+          <w:sz w:val="28"/>
+          <w:szCs w:val="28"/>
+        </w:rPr>
+        <w:t>Result</w:t>
+      </w:r>
+      <w:r>
+        <w:rPr>
+          <w:rFonts w:asciiTheme="majorBidi" w:hAnsiTheme="majorBidi" w:cstheme="majorBidi"/>
+          <w:sz w:val="28"/>
+          <w:szCs w:val="28"/>
+        </w:rPr>
+        <w:t xml:space="preserve"> </w:t>
+      </w:r>
+      <w:r>
+        <w:rPr>
+          <w:rFonts w:asciiTheme="majorBidi" w:hAnsiTheme="majorBidi" w:cstheme="majorBidi"/>
+          <w:sz w:val="28"/>
+          <w:szCs w:val="28"/>
+        </w:rPr>
+        <w:t xml:space="preserve">→ </w:t>
+      </w:r>
+      <w:r>
+        <w:rPr>
+          <w:rFonts w:asciiTheme="majorBidi" w:hAnsiTheme="majorBidi" w:cstheme="majorBidi"/>
+          <w:sz w:val="28"/>
+          <w:szCs w:val="28"/>
+        </w:rPr>
+        <w:t>If the data was the string "</w:t>
+      </w:r>
+      <w:r>
+        <w:rPr>
+          <w:rFonts w:asciiTheme="majorBidi" w:hAnsiTheme="majorBidi" w:cstheme="majorBidi"/>
+          <w:b/>
+          <w:bCs/>
+          <w:i/>
+          <w:iCs/>
+          <w:sz w:val="28"/>
+          <w:szCs w:val="28"/>
+        </w:rPr>
+        <w:t>true</w:t>
+      </w:r>
+      <w:r>
+        <w:rPr>
+          <w:rFonts w:asciiTheme="majorBidi" w:hAnsiTheme="majorBidi" w:cstheme="majorBidi"/>
+          <w:sz w:val="28"/>
+          <w:szCs w:val="28"/>
+        </w:rPr>
+        <w:t xml:space="preserve">", it becomes the </w:t>
+      </w:r>
+      <w:proofErr w:type="spellStart"/>
+      <w:r>
+        <w:rPr>
+          <w:rFonts w:asciiTheme="majorBidi" w:hAnsiTheme="majorBidi" w:cstheme="majorBidi"/>
+          <w:sz w:val="28"/>
+          <w:szCs w:val="28"/>
+        </w:rPr>
+        <w:t>boolean</w:t>
+      </w:r>
+      <w:proofErr w:type="spellEnd"/>
+      <w:r>
+        <w:rPr>
+          <w:rFonts w:asciiTheme="majorBidi" w:hAnsiTheme="majorBidi" w:cstheme="majorBidi"/>
+          <w:sz w:val="28"/>
+          <w:szCs w:val="28"/>
+        </w:rPr>
+        <w:t xml:space="preserve"> True. If it was the string "</w:t>
+      </w:r>
+      <w:r>
+        <w:rPr>
+          <w:rFonts w:asciiTheme="majorBidi" w:hAnsiTheme="majorBidi" w:cstheme="majorBidi"/>
+          <w:b/>
+          <w:bCs/>
+          <w:i/>
+          <w:iCs/>
+          <w:sz w:val="28"/>
+          <w:szCs w:val="28"/>
+        </w:rPr>
+        <w:t>no</w:t>
+      </w:r>
+      <w:r>
+        <w:rPr>
+          <w:rFonts w:asciiTheme="majorBidi" w:hAnsiTheme="majorBidi" w:cstheme="majorBidi"/>
+          <w:sz w:val="28"/>
+          <w:szCs w:val="28"/>
+        </w:rPr>
+        <w:t>", it becomes False.</w:t>
       </w:r>
     </w:p>
     <w:p>
@@ -10709,7 +12788,7 @@
 </file>
 
 <file path=word/numbering.xml><?xml version="1.0" encoding="utf-8"?>
-<w:numbering xmlns:wpc="http://schemas.microsoft.com/office/word/2010/wordprocessingCanvas" xmlns:cx="http://schemas.microsoft.com/office/drawing/2014/chartex" xmlns:cx1="http://schemas.microsoft.com/office/drawing/2015/9/8/chartex" xmlns:cx2="http://schemas.microsoft.com/office/drawing/2015/10/21/chartex" xmlns:cx3="http://schemas.microsoft.com/office/drawing/2016/5/9/chartex" xmlns:cx4="http://schemas.microsoft.com/office/drawing/2016/5/10/chartex" xmlns:cx5="http://schemas.microsoft.com/office/drawing/2016/5/11/chartex" xmlns:cx6="http://schemas.microsoft.com/office/drawing/2016/5/12/chartex" xmlns:cx7="http://schemas.microsoft.com/office/drawing/2016/5/13/chartex" xmlns:cx8="http://schemas.microsoft.com/office/drawing/2016/5/14/chartex" xmlns:mc="http://schemas.openxmlformats.org/markup-compatibility/2006" xmlns:aink="http://schemas.microsoft.com/office/drawing/2016/ink" xmlns:am3d="http://schemas.microsoft.com/office/drawing/2017/model3d" xmlns:o="urn:schemas-microsoft-com:office:office" xmlns:oel="http://schemas.microsoft.com/office/2019/extlst" xmlns:r="http://schemas.openxmlformats.org/officeDocument/2006/relationships" xmlns:m="http://schemas.openxmlformats.org/officeDocument/2006/math" xmlns:v="urn:schemas-microsoft-com:vml" xmlns:wp14="http://schemas.microsoft.com/office/word/2010/wordprocessingDrawing" xmlns:wp="http://schemas.openxmlformats.org/drawingml/2006/wordprocessingDrawing" xmlns:w10="urn:schemas-microsoft-com:office:word" xmlns:w="http://schemas.openxmlformats.org/wordprocessingml/2006/main" xmlns:w14="http://schemas.microsoft.com/office/word/2010/wordml" xmlns:w15="http://schemas.microsoft.com/office/word/2012/wordml" xmlns:w16cex="http://schemas.microsoft.com/office/word/2018/wordml/cex" xmlns:w16cid="http://schemas.microsoft.com/office/word/2016/wordml/cid" xmlns:w16="http://schemas.microsoft.com/office/word/2018/wordml" xmlns:w16du="http://schemas.microsoft.com/office/word/2023/wordml/word16du" xmlns:w16sdtdh="http://schemas.microsoft.com/office/word/2020/wordml/sdtdatahash" xmlns:w16sdtfl="http://schemas.microsoft.com/office/word/2024/wordml/sdtformatlock" xmlns:w16se="http://schemas.microsoft.com/office/word/2015/wordml/symex" xmlns:wpg="http://schemas.microsoft.com/office/word/2010/wordprocessingGroup" xmlns:wpi="http://schemas.microsoft.com/office/word/2010/wordprocessingInk" xmlns:wne="http://schemas.microsoft.com/office/word/2006/wordml" xmlns:wps="http://schemas.microsoft.com/office/word/2010/wordprocessingShape" mc:Ignorable="w14 w15 w16se w16cid w16 w16cex w16sdtdh w16sdtfl w16du wp14">
+<w:numbering xmlns:wpc="http://schemas.microsoft.com/office/word/2010/wordprocessingCanvas" xmlns:cx="http://schemas.microsoft.com/office/drawing/2014/chartex" xmlns:cx1="http://schemas.microsoft.com/office/drawing/2015/9/8/chartex" xmlns:cx2="http://schemas.microsoft.com/office/drawing/2015/10/21/chartex" xmlns:cx3="http://schemas.microsoft.com/office/drawing/2016/5/9/chartex" xmlns:cx4="http://schemas.microsoft.com/office/drawing/2016/5/10/chartex" xmlns:cx5="http://schemas.microsoft.com/office/drawing/2016/5/11/chartex" xmlns:cx6="http://schemas.microsoft.com/office/drawing/2016/5/12/chartex" xmlns:cx7="http://schemas.microsoft.com/office/drawing/2016/5/13/chartex" xmlns:cx8="http://schemas.microsoft.com/office/drawing/2016/5/14/chartex" xmlns:mc="http://schemas.openxmlformats.org/markup-compatibility/2006" xmlns:aink="http://schemas.microsoft.com/office/drawing/2016/ink" xmlns:am3d="http://schemas.microsoft.com/office/drawing/2017/model3d" xmlns:o="urn:schemas-microsoft-com:office:office" xmlns:oel="http://schemas.microsoft.com/office/2019/extlst" xmlns:r="http://schemas.openxmlformats.org/officeDocument/2006/relationships" xmlns:m="http://schemas.openxmlformats.org/officeDocument/2006/math" xmlns:v="urn:schemas-microsoft-com:vml" xmlns:wp14="http://schemas.microsoft.com/office/word/2010/wordprocessingDrawing" xmlns:wp="http://schemas.openxmlformats.org/drawingml/2006/wordprocessingDrawing" xmlns:w10="urn:schemas-microsoft-com:office:word" xmlns:w="http://schemas.openxmlformats.org/wordprocessingml/2006/main" xmlns:w14="http://schemas.microsoft.com/office/word/2010/wordml" xmlns:w15="http://schemas.microsoft.com/office/word/2012/wordml" xmlns:w16cex="http://schemas.microsoft.com/office/word/2018/wordml/cex" xmlns:w16cid="http://schemas.microsoft.com/office/word/2016/wordml/cid" xmlns:w16="http://schemas.microsoft.com/office/word/2018/wordml" xmlns:w16sdtdh="http://schemas.microsoft.com/office/word/2020/wordml/sdtdatahash" xmlns:w16se="http://schemas.microsoft.com/office/word/2015/wordml/symex" xmlns:wpg="http://schemas.microsoft.com/office/word/2010/wordprocessingGroup" xmlns:wpi="http://schemas.microsoft.com/office/word/2010/wordprocessingInk" xmlns:wne="http://schemas.microsoft.com/office/word/2006/wordml" xmlns:wps="http://schemas.microsoft.com/office/word/2010/wordprocessingShape" mc:Ignorable="w14 w15 w16se w16cid w16 w16cex w16sdtdh wp14">
   <w:abstractNum w:abstractNumId="0" w15:restartNumberingAfterBreak="0">
     <w:nsid w:val="001D76B7"/>
     <w:multiLevelType w:val="hybridMultilevel"/>
@@ -10938,6 +13017,119 @@
     </w:lvl>
   </w:abstractNum>
   <w:abstractNum w:abstractNumId="2" w15:restartNumberingAfterBreak="0">
+    <w:nsid w:val="192C59B3"/>
+    <w:multiLevelType w:val="hybridMultilevel"/>
+    <w:tmpl w:val="CE10E982"/>
+    <w:lvl w:ilvl="0" w:tplc="0409000F">
+      <w:start w:val="1"/>
+      <w:numFmt w:val="decimal"/>
+      <w:lvlText w:val="%1."/>
+      <w:lvlJc w:val="left"/>
+      <w:pPr>
+        <w:ind w:left="720" w:hanging="360"/>
+      </w:pPr>
+      <w:rPr>
+        <w:rFonts w:hint="default"/>
+      </w:rPr>
+    </w:lvl>
+    <w:lvl w:ilvl="1" w:tplc="FFFFFFFF" w:tentative="1">
+      <w:start w:val="1"/>
+      <w:numFmt w:val="bullet"/>
+      <w:lvlText w:val="o"/>
+      <w:lvlJc w:val="left"/>
+      <w:pPr>
+        <w:ind w:left="1440" w:hanging="360"/>
+      </w:pPr>
+      <w:rPr>
+        <w:rFonts w:ascii="Courier New" w:hAnsi="Courier New" w:cs="Courier New" w:hint="default"/>
+      </w:rPr>
+    </w:lvl>
+    <w:lvl w:ilvl="2" w:tplc="FFFFFFFF" w:tentative="1">
+      <w:start w:val="1"/>
+      <w:numFmt w:val="bullet"/>
+      <w:lvlText w:val=""/>
+      <w:lvlJc w:val="left"/>
+      <w:pPr>
+        <w:ind w:left="2160" w:hanging="360"/>
+      </w:pPr>
+      <w:rPr>
+        <w:rFonts w:ascii="Wingdings" w:hAnsi="Wingdings" w:hint="default"/>
+      </w:rPr>
+    </w:lvl>
+    <w:lvl w:ilvl="3" w:tplc="FFFFFFFF" w:tentative="1">
+      <w:start w:val="1"/>
+      <w:numFmt w:val="bullet"/>
+      <w:lvlText w:val=""/>
+      <w:lvlJc w:val="left"/>
+      <w:pPr>
+        <w:ind w:left="2880" w:hanging="360"/>
+      </w:pPr>
+      <w:rPr>
+        <w:rFonts w:ascii="Symbol" w:hAnsi="Symbol" w:hint="default"/>
+      </w:rPr>
+    </w:lvl>
+    <w:lvl w:ilvl="4" w:tplc="FFFFFFFF" w:tentative="1">
+      <w:start w:val="1"/>
+      <w:numFmt w:val="bullet"/>
+      <w:lvlText w:val="o"/>
+      <w:lvlJc w:val="left"/>
+      <w:pPr>
+        <w:ind w:left="3600" w:hanging="360"/>
+      </w:pPr>
+      <w:rPr>
+        <w:rFonts w:ascii="Courier New" w:hAnsi="Courier New" w:cs="Courier New" w:hint="default"/>
+      </w:rPr>
+    </w:lvl>
+    <w:lvl w:ilvl="5" w:tplc="FFFFFFFF" w:tentative="1">
+      <w:start w:val="1"/>
+      <w:numFmt w:val="bullet"/>
+      <w:lvlText w:val=""/>
+      <w:lvlJc w:val="left"/>
+      <w:pPr>
+        <w:ind w:left="4320" w:hanging="360"/>
+      </w:pPr>
+      <w:rPr>
+        <w:rFonts w:ascii="Wingdings" w:hAnsi="Wingdings" w:hint="default"/>
+      </w:rPr>
+    </w:lvl>
+    <w:lvl w:ilvl="6" w:tplc="FFFFFFFF" w:tentative="1">
+      <w:start w:val="1"/>
+      <w:numFmt w:val="bullet"/>
+      <w:lvlText w:val=""/>
+      <w:lvlJc w:val="left"/>
+      <w:pPr>
+        <w:ind w:left="5040" w:hanging="360"/>
+      </w:pPr>
+      <w:rPr>
+        <w:rFonts w:ascii="Symbol" w:hAnsi="Symbol" w:hint="default"/>
+      </w:rPr>
+    </w:lvl>
+    <w:lvl w:ilvl="7" w:tplc="FFFFFFFF" w:tentative="1">
+      <w:start w:val="1"/>
+      <w:numFmt w:val="bullet"/>
+      <w:lvlText w:val="o"/>
+      <w:lvlJc w:val="left"/>
+      <w:pPr>
+        <w:ind w:left="5760" w:hanging="360"/>
+      </w:pPr>
+      <w:rPr>
+        <w:rFonts w:ascii="Courier New" w:hAnsi="Courier New" w:cs="Courier New" w:hint="default"/>
+      </w:rPr>
+    </w:lvl>
+    <w:lvl w:ilvl="8" w:tplc="FFFFFFFF" w:tentative="1">
+      <w:start w:val="1"/>
+      <w:numFmt w:val="bullet"/>
+      <w:lvlText w:val=""/>
+      <w:lvlJc w:val="left"/>
+      <w:pPr>
+        <w:ind w:left="6480" w:hanging="360"/>
+      </w:pPr>
+      <w:rPr>
+        <w:rFonts w:ascii="Wingdings" w:hAnsi="Wingdings" w:hint="default"/>
+      </w:rPr>
+    </w:lvl>
+  </w:abstractNum>
+  <w:abstractNum w:abstractNumId="3" w15:restartNumberingAfterBreak="0">
     <w:nsid w:val="19FD29C0"/>
     <w:multiLevelType w:val="hybridMultilevel"/>
     <w:tmpl w:val="D410F6F4"/>
@@ -11050,7 +13242,120 @@
       </w:rPr>
     </w:lvl>
   </w:abstractNum>
-  <w:abstractNum w:abstractNumId="3" w15:restartNumberingAfterBreak="0">
+  <w:abstractNum w:abstractNumId="4" w15:restartNumberingAfterBreak="0">
+    <w:nsid w:val="1E08461E"/>
+    <w:multiLevelType w:val="hybridMultilevel"/>
+    <w:tmpl w:val="E8CC8FA6"/>
+    <w:lvl w:ilvl="0" w:tplc="0409000D">
+      <w:start w:val="1"/>
+      <w:numFmt w:val="bullet"/>
+      <w:lvlText w:val=""/>
+      <w:lvlJc w:val="left"/>
+      <w:pPr>
+        <w:ind w:left="720" w:hanging="360"/>
+      </w:pPr>
+      <w:rPr>
+        <w:rFonts w:ascii="Wingdings" w:hAnsi="Wingdings" w:hint="default"/>
+      </w:rPr>
+    </w:lvl>
+    <w:lvl w:ilvl="1" w:tplc="FFFFFFFF" w:tentative="1">
+      <w:start w:val="1"/>
+      <w:numFmt w:val="bullet"/>
+      <w:lvlText w:val="o"/>
+      <w:lvlJc w:val="left"/>
+      <w:pPr>
+        <w:ind w:left="1440" w:hanging="360"/>
+      </w:pPr>
+      <w:rPr>
+        <w:rFonts w:ascii="Courier New" w:hAnsi="Courier New" w:cs="Courier New" w:hint="default"/>
+      </w:rPr>
+    </w:lvl>
+    <w:lvl w:ilvl="2" w:tplc="FFFFFFFF" w:tentative="1">
+      <w:start w:val="1"/>
+      <w:numFmt w:val="bullet"/>
+      <w:lvlText w:val=""/>
+      <w:lvlJc w:val="left"/>
+      <w:pPr>
+        <w:ind w:left="2160" w:hanging="360"/>
+      </w:pPr>
+      <w:rPr>
+        <w:rFonts w:ascii="Wingdings" w:hAnsi="Wingdings" w:hint="default"/>
+      </w:rPr>
+    </w:lvl>
+    <w:lvl w:ilvl="3" w:tplc="FFFFFFFF" w:tentative="1">
+      <w:start w:val="1"/>
+      <w:numFmt w:val="bullet"/>
+      <w:lvlText w:val=""/>
+      <w:lvlJc w:val="left"/>
+      <w:pPr>
+        <w:ind w:left="2880" w:hanging="360"/>
+      </w:pPr>
+      <w:rPr>
+        <w:rFonts w:ascii="Symbol" w:hAnsi="Symbol" w:hint="default"/>
+      </w:rPr>
+    </w:lvl>
+    <w:lvl w:ilvl="4" w:tplc="FFFFFFFF" w:tentative="1">
+      <w:start w:val="1"/>
+      <w:numFmt w:val="bullet"/>
+      <w:lvlText w:val="o"/>
+      <w:lvlJc w:val="left"/>
+      <w:pPr>
+        <w:ind w:left="3600" w:hanging="360"/>
+      </w:pPr>
+      <w:rPr>
+        <w:rFonts w:ascii="Courier New" w:hAnsi="Courier New" w:cs="Courier New" w:hint="default"/>
+      </w:rPr>
+    </w:lvl>
+    <w:lvl w:ilvl="5" w:tplc="FFFFFFFF" w:tentative="1">
+      <w:start w:val="1"/>
+      <w:numFmt w:val="bullet"/>
+      <w:lvlText w:val=""/>
+      <w:lvlJc w:val="left"/>
+      <w:pPr>
+        <w:ind w:left="4320" w:hanging="360"/>
+      </w:pPr>
+      <w:rPr>
+        <w:rFonts w:ascii="Wingdings" w:hAnsi="Wingdings" w:hint="default"/>
+      </w:rPr>
+    </w:lvl>
+    <w:lvl w:ilvl="6" w:tplc="FFFFFFFF" w:tentative="1">
+      <w:start w:val="1"/>
+      <w:numFmt w:val="bullet"/>
+      <w:lvlText w:val=""/>
+      <w:lvlJc w:val="left"/>
+      <w:pPr>
+        <w:ind w:left="5040" w:hanging="360"/>
+      </w:pPr>
+      <w:rPr>
+        <w:rFonts w:ascii="Symbol" w:hAnsi="Symbol" w:hint="default"/>
+      </w:rPr>
+    </w:lvl>
+    <w:lvl w:ilvl="7" w:tplc="FFFFFFFF" w:tentative="1">
+      <w:start w:val="1"/>
+      <w:numFmt w:val="bullet"/>
+      <w:lvlText w:val="o"/>
+      <w:lvlJc w:val="left"/>
+      <w:pPr>
+        <w:ind w:left="5760" w:hanging="360"/>
+      </w:pPr>
+      <w:rPr>
+        <w:rFonts w:ascii="Courier New" w:hAnsi="Courier New" w:cs="Courier New" w:hint="default"/>
+      </w:rPr>
+    </w:lvl>
+    <w:lvl w:ilvl="8" w:tplc="FFFFFFFF" w:tentative="1">
+      <w:start w:val="1"/>
+      <w:numFmt w:val="bullet"/>
+      <w:lvlText w:val=""/>
+      <w:lvlJc w:val="left"/>
+      <w:pPr>
+        <w:ind w:left="6480" w:hanging="360"/>
+      </w:pPr>
+      <w:rPr>
+        <w:rFonts w:ascii="Wingdings" w:hAnsi="Wingdings" w:hint="default"/>
+      </w:rPr>
+    </w:lvl>
+  </w:abstractNum>
+  <w:abstractNum w:abstractNumId="5" w15:restartNumberingAfterBreak="0">
     <w:nsid w:val="2176541B"/>
     <w:multiLevelType w:val="hybridMultilevel"/>
     <w:tmpl w:val="C0EA7982"/>
@@ -11163,7 +13468,7 @@
       </w:rPr>
     </w:lvl>
   </w:abstractNum>
-  <w:abstractNum w:abstractNumId="4" w15:restartNumberingAfterBreak="0">
+  <w:abstractNum w:abstractNumId="6" w15:restartNumberingAfterBreak="0">
     <w:nsid w:val="24FA3189"/>
     <w:multiLevelType w:val="hybridMultilevel"/>
     <w:tmpl w:val="3202E198"/>
@@ -11276,7 +13581,7 @@
       </w:rPr>
     </w:lvl>
   </w:abstractNum>
-  <w:abstractNum w:abstractNumId="5" w15:restartNumberingAfterBreak="0">
+  <w:abstractNum w:abstractNumId="7" w15:restartNumberingAfterBreak="0">
     <w:nsid w:val="293B73DF"/>
     <w:multiLevelType w:val="hybridMultilevel"/>
     <w:tmpl w:val="0D8C204E"/>
@@ -11389,7 +13694,7 @@
       </w:rPr>
     </w:lvl>
   </w:abstractNum>
-  <w:abstractNum w:abstractNumId="6" w15:restartNumberingAfterBreak="0">
+  <w:abstractNum w:abstractNumId="8" w15:restartNumberingAfterBreak="0">
     <w:nsid w:val="34C11203"/>
     <w:multiLevelType w:val="hybridMultilevel"/>
     <w:tmpl w:val="769E2BF0"/>
@@ -11502,7 +13807,7 @@
       </w:rPr>
     </w:lvl>
   </w:abstractNum>
-  <w:abstractNum w:abstractNumId="7" w15:restartNumberingAfterBreak="0">
+  <w:abstractNum w:abstractNumId="9" w15:restartNumberingAfterBreak="0">
     <w:nsid w:val="363E294B"/>
     <w:multiLevelType w:val="hybridMultilevel"/>
     <w:tmpl w:val="DC321996"/>
@@ -11615,7 +13920,7 @@
       </w:rPr>
     </w:lvl>
   </w:abstractNum>
-  <w:abstractNum w:abstractNumId="8" w15:restartNumberingAfterBreak="0">
+  <w:abstractNum w:abstractNumId="10" w15:restartNumberingAfterBreak="0">
     <w:nsid w:val="3C554F88"/>
     <w:multiLevelType w:val="hybridMultilevel"/>
     <w:tmpl w:val="AEF469DC"/>
@@ -11728,7 +14033,7 @@
       </w:rPr>
     </w:lvl>
   </w:abstractNum>
-  <w:abstractNum w:abstractNumId="9" w15:restartNumberingAfterBreak="0">
+  <w:abstractNum w:abstractNumId="11" w15:restartNumberingAfterBreak="0">
     <w:nsid w:val="3E6602E7"/>
     <w:multiLevelType w:val="hybridMultilevel"/>
     <w:tmpl w:val="1B54C54E"/>
@@ -11841,7 +14146,7 @@
       </w:rPr>
     </w:lvl>
   </w:abstractNum>
-  <w:abstractNum w:abstractNumId="10" w15:restartNumberingAfterBreak="0">
+  <w:abstractNum w:abstractNumId="12" w15:restartNumberingAfterBreak="0">
     <w:nsid w:val="3FB139BA"/>
     <w:multiLevelType w:val="hybridMultilevel"/>
     <w:tmpl w:val="858E383E"/>
@@ -11954,7 +14259,7 @@
       </w:rPr>
     </w:lvl>
   </w:abstractNum>
-  <w:abstractNum w:abstractNumId="11" w15:restartNumberingAfterBreak="0">
+  <w:abstractNum w:abstractNumId="13" w15:restartNumberingAfterBreak="0">
     <w:nsid w:val="429D4D02"/>
     <w:multiLevelType w:val="hybridMultilevel"/>
     <w:tmpl w:val="EEB40652"/>
@@ -12067,7 +14372,120 @@
       </w:rPr>
     </w:lvl>
   </w:abstractNum>
-  <w:abstractNum w:abstractNumId="12" w15:restartNumberingAfterBreak="0">
+  <w:abstractNum w:abstractNumId="14" w15:restartNumberingAfterBreak="0">
+    <w:nsid w:val="43277F11"/>
+    <w:multiLevelType w:val="hybridMultilevel"/>
+    <w:tmpl w:val="18C2155E"/>
+    <w:lvl w:ilvl="0" w:tplc="04090001">
+      <w:start w:val="1"/>
+      <w:numFmt w:val="bullet"/>
+      <w:lvlText w:val=""/>
+      <w:lvlJc w:val="left"/>
+      <w:pPr>
+        <w:ind w:left="1080" w:hanging="360"/>
+      </w:pPr>
+      <w:rPr>
+        <w:rFonts w:ascii="Symbol" w:hAnsi="Symbol" w:hint="default"/>
+      </w:rPr>
+    </w:lvl>
+    <w:lvl w:ilvl="1" w:tplc="04090003" w:tentative="1">
+      <w:start w:val="1"/>
+      <w:numFmt w:val="bullet"/>
+      <w:lvlText w:val="o"/>
+      <w:lvlJc w:val="left"/>
+      <w:pPr>
+        <w:ind w:left="1800" w:hanging="360"/>
+      </w:pPr>
+      <w:rPr>
+        <w:rFonts w:ascii="Courier New" w:hAnsi="Courier New" w:cs="Courier New" w:hint="default"/>
+      </w:rPr>
+    </w:lvl>
+    <w:lvl w:ilvl="2" w:tplc="04090005" w:tentative="1">
+      <w:start w:val="1"/>
+      <w:numFmt w:val="bullet"/>
+      <w:lvlText w:val=""/>
+      <w:lvlJc w:val="left"/>
+      <w:pPr>
+        <w:ind w:left="2520" w:hanging="360"/>
+      </w:pPr>
+      <w:rPr>
+        <w:rFonts w:ascii="Wingdings" w:hAnsi="Wingdings" w:hint="default"/>
+      </w:rPr>
+    </w:lvl>
+    <w:lvl w:ilvl="3" w:tplc="04090001" w:tentative="1">
+      <w:start w:val="1"/>
+      <w:numFmt w:val="bullet"/>
+      <w:lvlText w:val=""/>
+      <w:lvlJc w:val="left"/>
+      <w:pPr>
+        <w:ind w:left="3240" w:hanging="360"/>
+      </w:pPr>
+      <w:rPr>
+        <w:rFonts w:ascii="Symbol" w:hAnsi="Symbol" w:hint="default"/>
+      </w:rPr>
+    </w:lvl>
+    <w:lvl w:ilvl="4" w:tplc="04090003" w:tentative="1">
+      <w:start w:val="1"/>
+      <w:numFmt w:val="bullet"/>
+      <w:lvlText w:val="o"/>
+      <w:lvlJc w:val="left"/>
+      <w:pPr>
+        <w:ind w:left="3960" w:hanging="360"/>
+      </w:pPr>
+      <w:rPr>
+        <w:rFonts w:ascii="Courier New" w:hAnsi="Courier New" w:cs="Courier New" w:hint="default"/>
+      </w:rPr>
+    </w:lvl>
+    <w:lvl w:ilvl="5" w:tplc="04090005" w:tentative="1">
+      <w:start w:val="1"/>
+      <w:numFmt w:val="bullet"/>
+      <w:lvlText w:val=""/>
+      <w:lvlJc w:val="left"/>
+      <w:pPr>
+        <w:ind w:left="4680" w:hanging="360"/>
+      </w:pPr>
+      <w:rPr>
+        <w:rFonts w:ascii="Wingdings" w:hAnsi="Wingdings" w:hint="default"/>
+      </w:rPr>
+    </w:lvl>
+    <w:lvl w:ilvl="6" w:tplc="04090001" w:tentative="1">
+      <w:start w:val="1"/>
+      <w:numFmt w:val="bullet"/>
+      <w:lvlText w:val=""/>
+      <w:lvlJc w:val="left"/>
+      <w:pPr>
+        <w:ind w:left="5400" w:hanging="360"/>
+      </w:pPr>
+      <w:rPr>
+        <w:rFonts w:ascii="Symbol" w:hAnsi="Symbol" w:hint="default"/>
+      </w:rPr>
+    </w:lvl>
+    <w:lvl w:ilvl="7" w:tplc="04090003" w:tentative="1">
+      <w:start w:val="1"/>
+      <w:numFmt w:val="bullet"/>
+      <w:lvlText w:val="o"/>
+      <w:lvlJc w:val="left"/>
+      <w:pPr>
+        <w:ind w:left="6120" w:hanging="360"/>
+      </w:pPr>
+      <w:rPr>
+        <w:rFonts w:ascii="Courier New" w:hAnsi="Courier New" w:cs="Courier New" w:hint="default"/>
+      </w:rPr>
+    </w:lvl>
+    <w:lvl w:ilvl="8" w:tplc="04090005" w:tentative="1">
+      <w:start w:val="1"/>
+      <w:numFmt w:val="bullet"/>
+      <w:lvlText w:val=""/>
+      <w:lvlJc w:val="left"/>
+      <w:pPr>
+        <w:ind w:left="6840" w:hanging="360"/>
+      </w:pPr>
+      <w:rPr>
+        <w:rFonts w:ascii="Wingdings" w:hAnsi="Wingdings" w:hint="default"/>
+      </w:rPr>
+    </w:lvl>
+  </w:abstractNum>
+  <w:abstractNum w:abstractNumId="15" w15:restartNumberingAfterBreak="0">
     <w:nsid w:val="46590719"/>
     <w:multiLevelType w:val="hybridMultilevel"/>
     <w:tmpl w:val="FA88FFAE"/>
@@ -12180,7 +14598,7 @@
       </w:rPr>
     </w:lvl>
   </w:abstractNum>
-  <w:abstractNum w:abstractNumId="13" w15:restartNumberingAfterBreak="0">
+  <w:abstractNum w:abstractNumId="16" w15:restartNumberingAfterBreak="0">
     <w:nsid w:val="4755422F"/>
     <w:multiLevelType w:val="hybridMultilevel"/>
     <w:tmpl w:val="A846F1CA"/>
@@ -12293,7 +14711,7 @@
       </w:rPr>
     </w:lvl>
   </w:abstractNum>
-  <w:abstractNum w:abstractNumId="14" w15:restartNumberingAfterBreak="0">
+  <w:abstractNum w:abstractNumId="17" w15:restartNumberingAfterBreak="0">
     <w:nsid w:val="544F1F64"/>
     <w:multiLevelType w:val="hybridMultilevel"/>
     <w:tmpl w:val="F0488988"/>
@@ -12406,7 +14824,7 @@
       </w:rPr>
     </w:lvl>
   </w:abstractNum>
-  <w:abstractNum w:abstractNumId="15" w15:restartNumberingAfterBreak="0">
+  <w:abstractNum w:abstractNumId="18" w15:restartNumberingAfterBreak="0">
     <w:nsid w:val="5814529D"/>
     <w:multiLevelType w:val="hybridMultilevel"/>
     <w:tmpl w:val="2FBEDA14"/>
@@ -12519,7 +14937,7 @@
       </w:rPr>
     </w:lvl>
   </w:abstractNum>
-  <w:abstractNum w:abstractNumId="16" w15:restartNumberingAfterBreak="0">
+  <w:abstractNum w:abstractNumId="19" w15:restartNumberingAfterBreak="0">
     <w:nsid w:val="66BD1B7B"/>
     <w:multiLevelType w:val="hybridMultilevel"/>
     <w:tmpl w:val="E85239BC"/>
@@ -12632,7 +15050,120 @@
       </w:rPr>
     </w:lvl>
   </w:abstractNum>
-  <w:abstractNum w:abstractNumId="17" w15:restartNumberingAfterBreak="0">
+  <w:abstractNum w:abstractNumId="20" w15:restartNumberingAfterBreak="0">
+    <w:nsid w:val="67131E19"/>
+    <w:multiLevelType w:val="hybridMultilevel"/>
+    <w:tmpl w:val="CC3A7B36"/>
+    <w:lvl w:ilvl="0" w:tplc="04090003">
+      <w:start w:val="1"/>
+      <w:numFmt w:val="bullet"/>
+      <w:lvlText w:val="o"/>
+      <w:lvlJc w:val="left"/>
+      <w:pPr>
+        <w:ind w:left="720" w:hanging="360"/>
+      </w:pPr>
+      <w:rPr>
+        <w:rFonts w:ascii="Courier New" w:hAnsi="Courier New" w:cs="Courier New" w:hint="default"/>
+      </w:rPr>
+    </w:lvl>
+    <w:lvl w:ilvl="1" w:tplc="04090003" w:tentative="1">
+      <w:start w:val="1"/>
+      <w:numFmt w:val="bullet"/>
+      <w:lvlText w:val="o"/>
+      <w:lvlJc w:val="left"/>
+      <w:pPr>
+        <w:ind w:left="1440" w:hanging="360"/>
+      </w:pPr>
+      <w:rPr>
+        <w:rFonts w:ascii="Courier New" w:hAnsi="Courier New" w:cs="Courier New" w:hint="default"/>
+      </w:rPr>
+    </w:lvl>
+    <w:lvl w:ilvl="2" w:tplc="04090005" w:tentative="1">
+      <w:start w:val="1"/>
+      <w:numFmt w:val="bullet"/>
+      <w:lvlText w:val=""/>
+      <w:lvlJc w:val="left"/>
+      <w:pPr>
+        <w:ind w:left="2160" w:hanging="360"/>
+      </w:pPr>
+      <w:rPr>
+        <w:rFonts w:ascii="Wingdings" w:hAnsi="Wingdings" w:hint="default"/>
+      </w:rPr>
+    </w:lvl>
+    <w:lvl w:ilvl="3" w:tplc="04090001" w:tentative="1">
+      <w:start w:val="1"/>
+      <w:numFmt w:val="bullet"/>
+      <w:lvlText w:val=""/>
+      <w:lvlJc w:val="left"/>
+      <w:pPr>
+        <w:ind w:left="2880" w:hanging="360"/>
+      </w:pPr>
+      <w:rPr>
+        <w:rFonts w:ascii="Symbol" w:hAnsi="Symbol" w:hint="default"/>
+      </w:rPr>
+    </w:lvl>
+    <w:lvl w:ilvl="4" w:tplc="04090003" w:tentative="1">
+      <w:start w:val="1"/>
+      <w:numFmt w:val="bullet"/>
+      <w:lvlText w:val="o"/>
+      <w:lvlJc w:val="left"/>
+      <w:pPr>
+        <w:ind w:left="3600" w:hanging="360"/>
+      </w:pPr>
+      <w:rPr>
+        <w:rFonts w:ascii="Courier New" w:hAnsi="Courier New" w:cs="Courier New" w:hint="default"/>
+      </w:rPr>
+    </w:lvl>
+    <w:lvl w:ilvl="5" w:tplc="04090005" w:tentative="1">
+      <w:start w:val="1"/>
+      <w:numFmt w:val="bullet"/>
+      <w:lvlText w:val=""/>
+      <w:lvlJc w:val="left"/>
+      <w:pPr>
+        <w:ind w:left="4320" w:hanging="360"/>
+      </w:pPr>
+      <w:rPr>
+        <w:rFonts w:ascii="Wingdings" w:hAnsi="Wingdings" w:hint="default"/>
+      </w:rPr>
+    </w:lvl>
+    <w:lvl w:ilvl="6" w:tplc="04090001" w:tentative="1">
+      <w:start w:val="1"/>
+      <w:numFmt w:val="bullet"/>
+      <w:lvlText w:val=""/>
+      <w:lvlJc w:val="left"/>
+      <w:pPr>
+        <w:ind w:left="5040" w:hanging="360"/>
+      </w:pPr>
+      <w:rPr>
+        <w:rFonts w:ascii="Symbol" w:hAnsi="Symbol" w:hint="default"/>
+      </w:rPr>
+    </w:lvl>
+    <w:lvl w:ilvl="7" w:tplc="04090003" w:tentative="1">
+      <w:start w:val="1"/>
+      <w:numFmt w:val="bullet"/>
+      <w:lvlText w:val="o"/>
+      <w:lvlJc w:val="left"/>
+      <w:pPr>
+        <w:ind w:left="5760" w:hanging="360"/>
+      </w:pPr>
+      <w:rPr>
+        <w:rFonts w:ascii="Courier New" w:hAnsi="Courier New" w:cs="Courier New" w:hint="default"/>
+      </w:rPr>
+    </w:lvl>
+    <w:lvl w:ilvl="8" w:tplc="04090005" w:tentative="1">
+      <w:start w:val="1"/>
+      <w:numFmt w:val="bullet"/>
+      <w:lvlText w:val=""/>
+      <w:lvlJc w:val="left"/>
+      <w:pPr>
+        <w:ind w:left="6480" w:hanging="360"/>
+      </w:pPr>
+      <w:rPr>
+        <w:rFonts w:ascii="Wingdings" w:hAnsi="Wingdings" w:hint="default"/>
+      </w:rPr>
+    </w:lvl>
+  </w:abstractNum>
+  <w:abstractNum w:abstractNumId="21" w15:restartNumberingAfterBreak="0">
     <w:nsid w:val="693138D2"/>
     <w:multiLevelType w:val="hybridMultilevel"/>
     <w:tmpl w:val="1666CC16"/>
@@ -12745,7 +15276,7 @@
       </w:rPr>
     </w:lvl>
   </w:abstractNum>
-  <w:abstractNum w:abstractNumId="18" w15:restartNumberingAfterBreak="0">
+  <w:abstractNum w:abstractNumId="22" w15:restartNumberingAfterBreak="0">
     <w:nsid w:val="6A15664F"/>
     <w:multiLevelType w:val="hybridMultilevel"/>
     <w:tmpl w:val="7278EFF2"/>
@@ -12858,7 +15389,7 @@
       </w:rPr>
     </w:lvl>
   </w:abstractNum>
-  <w:abstractNum w:abstractNumId="19" w15:restartNumberingAfterBreak="0">
+  <w:abstractNum w:abstractNumId="23" w15:restartNumberingAfterBreak="0">
     <w:nsid w:val="6ABC78EB"/>
     <w:multiLevelType w:val="hybridMultilevel"/>
     <w:tmpl w:val="5C72057E"/>
@@ -12971,7 +15502,120 @@
       </w:rPr>
     </w:lvl>
   </w:abstractNum>
-  <w:abstractNum w:abstractNumId="20" w15:restartNumberingAfterBreak="0">
+  <w:abstractNum w:abstractNumId="24" w15:restartNumberingAfterBreak="0">
+    <w:nsid w:val="6F210875"/>
+    <w:multiLevelType w:val="hybridMultilevel"/>
+    <w:tmpl w:val="D512A856"/>
+    <w:lvl w:ilvl="0" w:tplc="04090001">
+      <w:start w:val="1"/>
+      <w:numFmt w:val="bullet"/>
+      <w:lvlText w:val=""/>
+      <w:lvlJc w:val="left"/>
+      <w:pPr>
+        <w:ind w:left="720" w:hanging="360"/>
+      </w:pPr>
+      <w:rPr>
+        <w:rFonts w:ascii="Symbol" w:hAnsi="Symbol" w:hint="default"/>
+      </w:rPr>
+    </w:lvl>
+    <w:lvl w:ilvl="1" w:tplc="FFFFFFFF" w:tentative="1">
+      <w:start w:val="1"/>
+      <w:numFmt w:val="bullet"/>
+      <w:lvlText w:val="o"/>
+      <w:lvlJc w:val="left"/>
+      <w:pPr>
+        <w:ind w:left="1440" w:hanging="360"/>
+      </w:pPr>
+      <w:rPr>
+        <w:rFonts w:ascii="Courier New" w:hAnsi="Courier New" w:cs="Courier New" w:hint="default"/>
+      </w:rPr>
+    </w:lvl>
+    <w:lvl w:ilvl="2" w:tplc="FFFFFFFF" w:tentative="1">
+      <w:start w:val="1"/>
+      <w:numFmt w:val="bullet"/>
+      <w:lvlText w:val=""/>
+      <w:lvlJc w:val="left"/>
+      <w:pPr>
+        <w:ind w:left="2160" w:hanging="360"/>
+      </w:pPr>
+      <w:rPr>
+        <w:rFonts w:ascii="Wingdings" w:hAnsi="Wingdings" w:hint="default"/>
+      </w:rPr>
+    </w:lvl>
+    <w:lvl w:ilvl="3" w:tplc="FFFFFFFF" w:tentative="1">
+      <w:start w:val="1"/>
+      <w:numFmt w:val="bullet"/>
+      <w:lvlText w:val=""/>
+      <w:lvlJc w:val="left"/>
+      <w:pPr>
+        <w:ind w:left="2880" w:hanging="360"/>
+      </w:pPr>
+      <w:rPr>
+        <w:rFonts w:ascii="Symbol" w:hAnsi="Symbol" w:hint="default"/>
+      </w:rPr>
+    </w:lvl>
+    <w:lvl w:ilvl="4" w:tplc="FFFFFFFF" w:tentative="1">
+      <w:start w:val="1"/>
+      <w:numFmt w:val="bullet"/>
+      <w:lvlText w:val="o"/>
+      <w:lvlJc w:val="left"/>
+      <w:pPr>
+        <w:ind w:left="3600" w:hanging="360"/>
+      </w:pPr>
+      <w:rPr>
+        <w:rFonts w:ascii="Courier New" w:hAnsi="Courier New" w:cs="Courier New" w:hint="default"/>
+      </w:rPr>
+    </w:lvl>
+    <w:lvl w:ilvl="5" w:tplc="FFFFFFFF" w:tentative="1">
+      <w:start w:val="1"/>
+      <w:numFmt w:val="bullet"/>
+      <w:lvlText w:val=""/>
+      <w:lvlJc w:val="left"/>
+      <w:pPr>
+        <w:ind w:left="4320" w:hanging="360"/>
+      </w:pPr>
+      <w:rPr>
+        <w:rFonts w:ascii="Wingdings" w:hAnsi="Wingdings" w:hint="default"/>
+      </w:rPr>
+    </w:lvl>
+    <w:lvl w:ilvl="6" w:tplc="FFFFFFFF" w:tentative="1">
+      <w:start w:val="1"/>
+      <w:numFmt w:val="bullet"/>
+      <w:lvlText w:val=""/>
+      <w:lvlJc w:val="left"/>
+      <w:pPr>
+        <w:ind w:left="5040" w:hanging="360"/>
+      </w:pPr>
+      <w:rPr>
+        <w:rFonts w:ascii="Symbol" w:hAnsi="Symbol" w:hint="default"/>
+      </w:rPr>
+    </w:lvl>
+    <w:lvl w:ilvl="7" w:tplc="FFFFFFFF" w:tentative="1">
+      <w:start w:val="1"/>
+      <w:numFmt w:val="bullet"/>
+      <w:lvlText w:val="o"/>
+      <w:lvlJc w:val="left"/>
+      <w:pPr>
+        <w:ind w:left="5760" w:hanging="360"/>
+      </w:pPr>
+      <w:rPr>
+        <w:rFonts w:ascii="Courier New" w:hAnsi="Courier New" w:cs="Courier New" w:hint="default"/>
+      </w:rPr>
+    </w:lvl>
+    <w:lvl w:ilvl="8" w:tplc="FFFFFFFF" w:tentative="1">
+      <w:start w:val="1"/>
+      <w:numFmt w:val="bullet"/>
+      <w:lvlText w:val=""/>
+      <w:lvlJc w:val="left"/>
+      <w:pPr>
+        <w:ind w:left="6480" w:hanging="360"/>
+      </w:pPr>
+      <w:rPr>
+        <w:rFonts w:ascii="Wingdings" w:hAnsi="Wingdings" w:hint="default"/>
+      </w:rPr>
+    </w:lvl>
+  </w:abstractNum>
+  <w:abstractNum w:abstractNumId="25" w15:restartNumberingAfterBreak="0">
     <w:nsid w:val="74676549"/>
     <w:multiLevelType w:val="hybridMultilevel"/>
     <w:tmpl w:val="E3F6D2D2"/>
@@ -13084,7 +15728,120 @@
       </w:rPr>
     </w:lvl>
   </w:abstractNum>
-  <w:abstractNum w:abstractNumId="21" w15:restartNumberingAfterBreak="0">
+  <w:abstractNum w:abstractNumId="26" w15:restartNumberingAfterBreak="0">
+    <w:nsid w:val="75E93DAE"/>
+    <w:multiLevelType w:val="hybridMultilevel"/>
+    <w:tmpl w:val="D3E0D3D0"/>
+    <w:lvl w:ilvl="0" w:tplc="04090001">
+      <w:start w:val="1"/>
+      <w:numFmt w:val="bullet"/>
+      <w:lvlText w:val=""/>
+      <w:lvlJc w:val="left"/>
+      <w:pPr>
+        <w:ind w:left="720" w:hanging="360"/>
+      </w:pPr>
+      <w:rPr>
+        <w:rFonts w:ascii="Symbol" w:hAnsi="Symbol" w:hint="default"/>
+      </w:rPr>
+    </w:lvl>
+    <w:lvl w:ilvl="1" w:tplc="FFFFFFFF" w:tentative="1">
+      <w:start w:val="1"/>
+      <w:numFmt w:val="bullet"/>
+      <w:lvlText w:val="o"/>
+      <w:lvlJc w:val="left"/>
+      <w:pPr>
+        <w:ind w:left="1440" w:hanging="360"/>
+      </w:pPr>
+      <w:rPr>
+        <w:rFonts w:ascii="Courier New" w:hAnsi="Courier New" w:cs="Courier New" w:hint="default"/>
+      </w:rPr>
+    </w:lvl>
+    <w:lvl w:ilvl="2" w:tplc="FFFFFFFF" w:tentative="1">
+      <w:start w:val="1"/>
+      <w:numFmt w:val="bullet"/>
+      <w:lvlText w:val=""/>
+      <w:lvlJc w:val="left"/>
+      <w:pPr>
+        <w:ind w:left="2160" w:hanging="360"/>
+      </w:pPr>
+      <w:rPr>
+        <w:rFonts w:ascii="Wingdings" w:hAnsi="Wingdings" w:hint="default"/>
+      </w:rPr>
+    </w:lvl>
+    <w:lvl w:ilvl="3" w:tplc="FFFFFFFF" w:tentative="1">
+      <w:start w:val="1"/>
+      <w:numFmt w:val="bullet"/>
+      <w:lvlText w:val=""/>
+      <w:lvlJc w:val="left"/>
+      <w:pPr>
+        <w:ind w:left="2880" w:hanging="360"/>
+      </w:pPr>
+      <w:rPr>
+        <w:rFonts w:ascii="Symbol" w:hAnsi="Symbol" w:hint="default"/>
+      </w:rPr>
+    </w:lvl>
+    <w:lvl w:ilvl="4" w:tplc="FFFFFFFF" w:tentative="1">
+      <w:start w:val="1"/>
+      <w:numFmt w:val="bullet"/>
+      <w:lvlText w:val="o"/>
+      <w:lvlJc w:val="left"/>
+      <w:pPr>
+        <w:ind w:left="3600" w:hanging="360"/>
+      </w:pPr>
+      <w:rPr>
+        <w:rFonts w:ascii="Courier New" w:hAnsi="Courier New" w:cs="Courier New" w:hint="default"/>
+      </w:rPr>
+    </w:lvl>
+    <w:lvl w:ilvl="5" w:tplc="FFFFFFFF" w:tentative="1">
+      <w:start w:val="1"/>
+      <w:numFmt w:val="bullet"/>
+      <w:lvlText w:val=""/>
+      <w:lvlJc w:val="left"/>
+      <w:pPr>
+        <w:ind w:left="4320" w:hanging="360"/>
+      </w:pPr>
+      <w:rPr>
+        <w:rFonts w:ascii="Wingdings" w:hAnsi="Wingdings" w:hint="default"/>
+      </w:rPr>
+    </w:lvl>
+    <w:lvl w:ilvl="6" w:tplc="FFFFFFFF" w:tentative="1">
+      <w:start w:val="1"/>
+      <w:numFmt w:val="bullet"/>
+      <w:lvlText w:val=""/>
+      <w:lvlJc w:val="left"/>
+      <w:pPr>
+        <w:ind w:left="5040" w:hanging="360"/>
+      </w:pPr>
+      <w:rPr>
+        <w:rFonts w:ascii="Symbol" w:hAnsi="Symbol" w:hint="default"/>
+      </w:rPr>
+    </w:lvl>
+    <w:lvl w:ilvl="7" w:tplc="FFFFFFFF" w:tentative="1">
+      <w:start w:val="1"/>
+      <w:numFmt w:val="bullet"/>
+      <w:lvlText w:val="o"/>
+      <w:lvlJc w:val="left"/>
+      <w:pPr>
+        <w:ind w:left="5760" w:hanging="360"/>
+      </w:pPr>
+      <w:rPr>
+        <w:rFonts w:ascii="Courier New" w:hAnsi="Courier New" w:cs="Courier New" w:hint="default"/>
+      </w:rPr>
+    </w:lvl>
+    <w:lvl w:ilvl="8" w:tplc="FFFFFFFF" w:tentative="1">
+      <w:start w:val="1"/>
+      <w:numFmt w:val="bullet"/>
+      <w:lvlText w:val=""/>
+      <w:lvlJc w:val="left"/>
+      <w:pPr>
+        <w:ind w:left="6480" w:hanging="360"/>
+      </w:pPr>
+      <w:rPr>
+        <w:rFonts w:ascii="Wingdings" w:hAnsi="Wingdings" w:hint="default"/>
+      </w:rPr>
+    </w:lvl>
+  </w:abstractNum>
+  <w:abstractNum w:abstractNumId="27" w15:restartNumberingAfterBreak="0">
     <w:nsid w:val="7DF90C2A"/>
     <w:multiLevelType w:val="hybridMultilevel"/>
     <w:tmpl w:val="B4C0E04A"/>
@@ -13171,76 +15928,94 @@
     </w:lvl>
   </w:abstractNum>
   <w:num w:numId="1" w16cid:durableId="2134981850">
+    <w:abstractNumId w:val="16"/>
+  </w:num>
+  <w:num w:numId="2" w16cid:durableId="253560014">
     <w:abstractNumId w:val="13"/>
   </w:num>
-  <w:num w:numId="2" w16cid:durableId="253560014">
-    <w:abstractNumId w:val="11"/>
-  </w:num>
   <w:num w:numId="3" w16cid:durableId="1227448938">
-    <w:abstractNumId w:val="15"/>
+    <w:abstractNumId w:val="18"/>
   </w:num>
   <w:num w:numId="4" w16cid:durableId="1447508899">
-    <w:abstractNumId w:val="5"/>
+    <w:abstractNumId w:val="7"/>
   </w:num>
   <w:num w:numId="5" w16cid:durableId="390420435">
     <w:abstractNumId w:val="0"/>
   </w:num>
   <w:num w:numId="6" w16cid:durableId="2024865983">
+    <w:abstractNumId w:val="10"/>
+  </w:num>
+  <w:num w:numId="7" w16cid:durableId="206262319">
+    <w:abstractNumId w:val="23"/>
+  </w:num>
+  <w:num w:numId="8" w16cid:durableId="1340548916">
+    <w:abstractNumId w:val="12"/>
+  </w:num>
+  <w:num w:numId="9" w16cid:durableId="800422201">
+    <w:abstractNumId w:val="17"/>
+  </w:num>
+  <w:num w:numId="10" w16cid:durableId="618802041">
+    <w:abstractNumId w:val="22"/>
+  </w:num>
+  <w:num w:numId="11" w16cid:durableId="2036424472">
+    <w:abstractNumId w:val="25"/>
+  </w:num>
+  <w:num w:numId="12" w16cid:durableId="743258066">
+    <w:abstractNumId w:val="5"/>
+  </w:num>
+  <w:num w:numId="13" w16cid:durableId="1225796498">
+    <w:abstractNumId w:val="9"/>
+  </w:num>
+  <w:num w:numId="14" w16cid:durableId="1988779782">
+    <w:abstractNumId w:val="15"/>
+  </w:num>
+  <w:num w:numId="15" w16cid:durableId="645168214">
+    <w:abstractNumId w:val="11"/>
+  </w:num>
+  <w:num w:numId="16" w16cid:durableId="515387715">
+    <w:abstractNumId w:val="6"/>
+  </w:num>
+  <w:num w:numId="17" w16cid:durableId="653873219">
+    <w:abstractNumId w:val="21"/>
+  </w:num>
+  <w:num w:numId="18" w16cid:durableId="861090326">
     <w:abstractNumId w:val="8"/>
   </w:num>
-  <w:num w:numId="7" w16cid:durableId="206262319">
+  <w:num w:numId="19" w16cid:durableId="1971981868">
     <w:abstractNumId w:val="19"/>
   </w:num>
-  <w:num w:numId="8" w16cid:durableId="1340548916">
-    <w:abstractNumId w:val="10"/>
-  </w:num>
-  <w:num w:numId="9" w16cid:durableId="800422201">
-    <w:abstractNumId w:val="14"/>
-  </w:num>
-  <w:num w:numId="10" w16cid:durableId="618802041">
-    <w:abstractNumId w:val="18"/>
-  </w:num>
-  <w:num w:numId="11" w16cid:durableId="2036424472">
-    <w:abstractNumId w:val="20"/>
-  </w:num>
-  <w:num w:numId="12" w16cid:durableId="743258066">
+  <w:num w:numId="20" w16cid:durableId="1068193651">
     <w:abstractNumId w:val="3"/>
-  </w:num>
-  <w:num w:numId="13" w16cid:durableId="1225796498">
-    <w:abstractNumId w:val="7"/>
-  </w:num>
-  <w:num w:numId="14" w16cid:durableId="1988779782">
-    <w:abstractNumId w:val="12"/>
-  </w:num>
-  <w:num w:numId="15" w16cid:durableId="645168214">
-    <w:abstractNumId w:val="9"/>
-  </w:num>
-  <w:num w:numId="16" w16cid:durableId="515387715">
-    <w:abstractNumId w:val="4"/>
-  </w:num>
-  <w:num w:numId="17" w16cid:durableId="653873219">
-    <w:abstractNumId w:val="17"/>
-  </w:num>
-  <w:num w:numId="18" w16cid:durableId="861090326">
-    <w:abstractNumId w:val="6"/>
-  </w:num>
-  <w:num w:numId="19" w16cid:durableId="1971981868">
-    <w:abstractNumId w:val="16"/>
-  </w:num>
-  <w:num w:numId="20" w16cid:durableId="1068193651">
-    <w:abstractNumId w:val="2"/>
   </w:num>
   <w:num w:numId="21" w16cid:durableId="1754356608">
     <w:abstractNumId w:val="1"/>
   </w:num>
   <w:num w:numId="22" w16cid:durableId="516430869">
-    <w:abstractNumId w:val="21"/>
+    <w:abstractNumId w:val="27"/>
+  </w:num>
+  <w:num w:numId="23" w16cid:durableId="763570878">
+    <w:abstractNumId w:val="20"/>
+  </w:num>
+  <w:num w:numId="24" w16cid:durableId="715397754">
+    <w:abstractNumId w:val="24"/>
+  </w:num>
+  <w:num w:numId="25" w16cid:durableId="940648279">
+    <w:abstractNumId w:val="4"/>
+  </w:num>
+  <w:num w:numId="26" w16cid:durableId="1675569467">
+    <w:abstractNumId w:val="2"/>
+  </w:num>
+  <w:num w:numId="27" w16cid:durableId="35589006">
+    <w:abstractNumId w:val="26"/>
+  </w:num>
+  <w:num w:numId="28" w16cid:durableId="1878733942">
+    <w:abstractNumId w:val="14"/>
   </w:num>
 </w:numbering>
 </file>
 
 <file path=word/styles.xml><?xml version="1.0" encoding="utf-8"?>
-<w:styles xmlns:mc="http://schemas.openxmlformats.org/markup-compatibility/2006" xmlns:r="http://schemas.openxmlformats.org/officeDocument/2006/relationships" xmlns:w="http://schemas.openxmlformats.org/wordprocessingml/2006/main" xmlns:w14="http://schemas.microsoft.com/office/word/2010/wordml" xmlns:w15="http://schemas.microsoft.com/office/word/2012/wordml" xmlns:w16cex="http://schemas.microsoft.com/office/word/2018/wordml/cex" xmlns:w16cid="http://schemas.microsoft.com/office/word/2016/wordml/cid" xmlns:w16="http://schemas.microsoft.com/office/word/2018/wordml" xmlns:w16du="http://schemas.microsoft.com/office/word/2023/wordml/word16du" xmlns:w16sdtdh="http://schemas.microsoft.com/office/word/2020/wordml/sdtdatahash" xmlns:w16sdtfl="http://schemas.microsoft.com/office/word/2024/wordml/sdtformatlock" xmlns:w16se="http://schemas.microsoft.com/office/word/2015/wordml/symex" mc:Ignorable="w14 w15 w16se w16cid w16 w16cex w16sdtdh w16sdtfl w16du">
+<w:styles xmlns:mc="http://schemas.openxmlformats.org/markup-compatibility/2006" xmlns:r="http://schemas.openxmlformats.org/officeDocument/2006/relationships" xmlns:w="http://schemas.openxmlformats.org/wordprocessingml/2006/main" xmlns:w14="http://schemas.microsoft.com/office/word/2010/wordml" xmlns:w15="http://schemas.microsoft.com/office/word/2012/wordml" xmlns:w16cex="http://schemas.microsoft.com/office/word/2018/wordml/cex" xmlns:w16cid="http://schemas.microsoft.com/office/word/2016/wordml/cid" xmlns:w16="http://schemas.microsoft.com/office/word/2018/wordml" xmlns:w16sdtdh="http://schemas.microsoft.com/office/word/2020/wordml/sdtdatahash" xmlns:w16se="http://schemas.microsoft.com/office/word/2015/wordml/symex" mc:Ignorable="w14 w15 w16se w16cid w16 w16cex w16sdtdh">
   <w:docDefaults>
     <w:rPrDefault>
       <w:rPr>
@@ -13643,7 +16418,6 @@
   <w:style w:type="character" w:default="1" w:styleId="DefaultParagraphFont">
     <w:name w:val="Default Paragraph Font"/>
     <w:uiPriority w:val="1"/>
-    <w:semiHidden/>
     <w:unhideWhenUsed/>
   </w:style>
   <w:style w:type="table" w:default="1" w:styleId="TableNormal">

</xml_diff>